<commit_message>
B2O3 Methods: references in the manuscript format, QE 2017/2020 added
Switches the reference list to the manuscript's Literature format (number,
tab, authors, italic journal, year, italic volume, pages; no titles) and the
in-text citations to bracketed numbers after punctuation, superscript in
Word. Adds the 2017 Quantum ESPRESSO paper and the 2020 GPU paper per the
code's citation guidance (17 references), and writes out the full UMA author
list in arXiv order. Word file, md copy and Docs version match.

Co-Authored-By: Claude Opus 5.5 <noreply@anthropic.com>
Claude-Session: https://claude.ai/code/session_01QtbBQvJTvwH5CtkzA6CTzs
</commit_message>
<xml_diff>
--- a/kb/papers/b2o3_bo_lpsc16_methods_2026_10_20.docx
+++ b/kb/papers/b2o3_bo_lpsc16_methods_2026_10_20.docx
@@ -26,7 +26,7 @@
         <w:rPr>
           <w:vertAlign w:val="superscript"/>
         </w:rPr>
-        <w:t xml:space="preserve">1,2</w:t>
+        <w:t xml:space="preserve">[1–4]</w:t>
       </w:r>
       <w:r>
         <w:t xml:space="preserve"> Pseudopotentials from the SSSP efficiency library (ultrasoft for Li, B, P, S, and Cl; projector augmented-wave (PAW) for O) were used with kinetic energy cutoffs of 60 Ry for the wavefunctions and 480 Ry for the charge density.</w:t>
@@ -35,7 +35,7 @@
         <w:rPr>
           <w:vertAlign w:val="superscript"/>
         </w:rPr>
-        <w:t xml:space="preserve">3</w:t>
+        <w:t xml:space="preserve">[5]</w:t>
       </w:r>
       <w:r>
         <w:t xml:space="preserve"> The Brillouin zone was sampled with Γ-centered Monkhorst–Pack grids, and Marzari–Vanderbilt smearing of 0.01 Ry was applied.</w:t>
@@ -44,7 +44,7 @@
         <w:rPr>
           <w:vertAlign w:val="superscript"/>
         </w:rPr>
-        <w:t xml:space="preserve">4</w:t>
+        <w:t xml:space="preserve">[6]</w:t>
       </w:r>
       <w:r>
         <w:t xml:space="preserve"> Ionic positions were relaxed until all force components fell below 10</w:t>
@@ -176,16 +176,16 @@
         <w:t xml:space="preserve">+</w:t>
       </w:r>
       <w:r>
-        <w:t xml:space="preserve"> disorder was sampled with the Universal Model for Atoms (UMA) machine-learning interatomic potential</w:t>
-      </w:r>
-      <w:r>
-        <w:rPr>
-          <w:vertAlign w:val="superscript"/>
-        </w:rPr>
-        <w:t xml:space="preserve">5</w:t>
-      </w:r>
-      <w:r>
-        <w:t xml:space="preserve">: the 45 distributions of S</w:t>
+        <w:t xml:space="preserve"> disorder was sampled with the Universal Model for Atoms (UMA) machine-learning interatomic potential:</w:t>
+      </w:r>
+      <w:r>
+        <w:rPr>
+          <w:vertAlign w:val="superscript"/>
+        </w:rPr>
+        <w:t xml:space="preserve">[7]</w:t>
+      </w:r>
+      <w:r>
+        <w:t xml:space="preserve"> the 45 distributions of S</w:t>
       </w:r>
       <w:r>
         <w:rPr>
@@ -586,7 +586,7 @@
         <w:rPr>
           <w:vertAlign w:val="superscript"/>
         </w:rPr>
-        <w:t xml:space="preserve">6</w:t>
+        <w:t xml:space="preserve">[8]</w:t>
       </w:r>
       <w:r>
         <w:t xml:space="preserve"> and the ions were finally relaxed at </w:t>
@@ -629,7 +629,7 @@
         <w:rPr>
           <w:vertAlign w:val="superscript"/>
         </w:rPr>
-        <w:t xml:space="preserve">5,7</w:t>
+        <w:t xml:space="preserve">[7,9]</w:t>
       </w:r>
       <w:r>
         <w:t xml:space="preserve"> The </w:t>
@@ -1066,7 +1066,7 @@
         <w:rPr>
           <w:vertAlign w:val="superscript"/>
         </w:rPr>
-        <w:t xml:space="preserve">8,9</w:t>
+        <w:t xml:space="preserve">[10,11]</w:t>
       </w:r>
       <w:r>
         <w:t xml:space="preserve"> On a grid with ~0.25 Å spacing, the bond valence sum of a Li</w:t>
@@ -1390,7 +1390,7 @@
         <w:rPr>
           <w:vertAlign w:val="superscript"/>
         </w:rPr>
-        <w:t xml:space="preserve">10</w:t>
+        <w:t xml:space="preserve">[12]</w:t>
       </w:r>
       <w:r>
         <w:t xml:space="preserve"> and were broadened with a 0.05 eV Gaussian for display. Energies were referenced to the valence band maximum (VBM), which was taken from the Kohn–Sham eigenvalues of a fixed-occupation calculation. The electron localization function (ELF) was calculated from the SCF valence density,</w:t>
@@ -1399,7 +1399,7 @@
         <w:rPr>
           <w:vertAlign w:val="superscript"/>
         </w:rPr>
-        <w:t xml:space="preserve">11</w:t>
+        <w:t xml:space="preserve">[13]</w:t>
       </w:r>
       <w:r>
         <w:t xml:space="preserve"> and its value at the bond midpoint was averaged over all bonds of each type (bonds identified within 2.15, 1.9, 2.3, 2.9, and 2.95 Å for B–S, P–O, P–S, Li–S, and Li–Cl, respectively).</w:t>
@@ -1417,7 +1417,7 @@
         <w:rPr>
           <w:vertAlign w:val="superscript"/>
         </w:rPr>
-        <w:t xml:space="preserve">12</w:t>
+        <w:t xml:space="preserve">[14]</w:t>
       </w:r>
       <w:r>
         <w:t xml:space="preserve"> was performed with LOBSTER 5.1.1.</w:t>
@@ -1426,7 +1426,7 @@
         <w:rPr>
           <w:vertAlign w:val="superscript"/>
         </w:rPr>
-        <w:t xml:space="preserve">13,14</w:t>
+        <w:t xml:space="preserve">[15,16]</w:t>
       </w:r>
       <w:r>
         <w:t xml:space="preserve"> Because LOBSTER requires PAW wavefunctions, the SCF and non-self-consistent (no symmetry, 960 bands) calculations were repeated on the same structure with PAW datasets from PSlibrary,</w:t>
@@ -1435,7 +1435,7 @@
         <w:rPr>
           <w:vertAlign w:val="superscript"/>
         </w:rPr>
-        <w:t xml:space="preserve">15</w:t>
+        <w:t xml:space="preserve">[17]</w:t>
       </w:r>
       <w:r>
         <w:t xml:space="preserve"> and the wavefunctions were projected onto the pbeVaspFit2015 basis (Li 1</w:t>
@@ -1541,137 +1541,638 @@
     </w:p>
     <w:p>
       <w:pPr>
+        <w:tabs>
+          <w:tab w:val="left" w:pos="480"/>
+        </w:tabs>
         <w:spacing w:after="0" w:line="480" w:lineRule="auto"/>
         <w:ind w:left="480" w:hanging="480"/>
       </w:pPr>
       <w:r>
-        <w:t xml:space="preserve">[1] P. Giannozzi, S. Baroni, N. Bonini, M. Calandra, R. Car, C. Cavazzoni, D. Ceresoli, G. L. Chiarotti, M. Cococcioni, I. Dabo, A. Dal Corso, S. de Gironcoli, S. Fabris, G. Fratesi, R. Gebauer, U. Gerstmann, C. Gougoussis, A. Kokalj, M. Lazzeri, L. Martin-Samos, N. Marzari, F. Mauri, R. Mazzarello, S. Paolini, A. Pasquarello, L. Paulatto, C. Sbraccia, S. Scandolo, G. Sclauzero, A. P. Seitsonen, A. Smogunov, P. Umari, R. M. Wentzcovitch, QUANTUM ESPRESSO: a modular and open-source software project for quantum simulations of materials, J. Phys.: Condens. Matter 21 (2009) 395502. https://doi.org/10.1088/0953-8984/21/39/395502.</w:t>
+        <w:t xml:space="preserve">1.</w:t>
+      </w:r>
+      <w:r>
+        <w:tab/>
+      </w:r>
+      <w:r>
+        <w:t xml:space="preserve">P. Giannozzi, S. Baroni, N. Bonini, M. Calandra, R. Car, C. Cavazzoni, D. Ceresoli, G. L. Chiarotti, M. Cococcioni, I. Dabo, A. Dal Corso, S. de Gironcoli, S. Fabris, G. Fratesi, R. Gebauer, U. Gerstmann, C. Gougoussis, A. Kokalj, M. Lazzeri, L. Martin-Samos, N. Marzari, F. Mauri, R. Mazzarello, S. Paolini, A. Pasquarello, L. Paulatto, C. Sbraccia, S. Scandolo, G. Sclauzero, A. P. Seitsonen, A. Smogunov, P. Umari, R. M. Wentzcovitch, </w:t>
+      </w:r>
+      <w:r>
+        <w:rPr>
+          <w:i/>
+          <w:iCs/>
+        </w:rPr>
+        <w:t xml:space="preserve">J. Phys.: Condens. Matter</w:t>
+      </w:r>
+      <w:r>
+        <w:t xml:space="preserve"> 2009, </w:t>
+      </w:r>
+      <w:r>
+        <w:rPr>
+          <w:i/>
+          <w:iCs/>
+        </w:rPr>
+        <w:t xml:space="preserve">21</w:t>
+      </w:r>
+      <w:r>
+        <w:t xml:space="preserve">, 395502.</w:t>
       </w:r>
     </w:p>
     <w:p>
       <w:pPr>
+        <w:tabs>
+          <w:tab w:val="left" w:pos="480"/>
+        </w:tabs>
         <w:spacing w:after="0" w:line="480" w:lineRule="auto"/>
         <w:ind w:left="480" w:hanging="480"/>
       </w:pPr>
       <w:r>
-        <w:t xml:space="preserve">[2] J. P. Perdew, K. Burke, M. Ernzerhof, Generalized gradient approximation made simple, Phys. Rev. Lett. 77 (1996) 3865–3868. https://doi.org/10.1103/PhysRevLett.77.3865.</w:t>
+        <w:t xml:space="preserve">2.</w:t>
+      </w:r>
+      <w:r>
+        <w:tab/>
+      </w:r>
+      <w:r>
+        <w:t xml:space="preserve">P. Giannozzi, O. Andreussi, T. Brumme, O. Bunau, M. Buongiorno Nardelli, M. Calandra, R. Car, C. Cavazzoni, D. Ceresoli, M. Cococcioni, N. Colonna, I. Carnimeo, A. Dal Corso, S. de Gironcoli, P. Delugas, R. A. DiStasio Jr., A. Ferretti, A. Floris, G. Fratesi, G. Fugallo, R. Gebauer, U. Gerstmann, F. Giustino, T. Gorni, J. Jia, M. Kawamura, H.-Y. Ko, A. Kokalj, E. Küçükbenli, M. Lazzeri, M. Marsili, N. Marzari, F. Mauri, N. L. Nguyen, H.-V. Nguyen, A. Otero-de-la-Roza, L. Paulatto, S. Poncé, D. Rocca, R. Sabatini, B. Santra, M. Schlipf, A. P. Seitsonen, A. Smogunov, I. Timrov, T. Thonhauser, P. Umari, N. Vast, X. Wu, S. Baroni, </w:t>
+      </w:r>
+      <w:r>
+        <w:rPr>
+          <w:i/>
+          <w:iCs/>
+        </w:rPr>
+        <w:t xml:space="preserve">J. Phys.: Condens. Matter</w:t>
+      </w:r>
+      <w:r>
+        <w:t xml:space="preserve"> 2017, </w:t>
+      </w:r>
+      <w:r>
+        <w:rPr>
+          <w:i/>
+          <w:iCs/>
+        </w:rPr>
+        <w:t xml:space="preserve">29</w:t>
+      </w:r>
+      <w:r>
+        <w:t xml:space="preserve">, 465901.</w:t>
       </w:r>
     </w:p>
     <w:p>
       <w:pPr>
+        <w:tabs>
+          <w:tab w:val="left" w:pos="480"/>
+        </w:tabs>
         <w:spacing w:after="0" w:line="480" w:lineRule="auto"/>
         <w:ind w:left="480" w:hanging="480"/>
       </w:pPr>
       <w:r>
-        <w:t xml:space="preserve">[3] G. Prandini, A. Marrazzo, I. E. Castelli, N. Mounet, N. Marzari, Precision and efficiency in solid-state pseudopotential calculations, npj Comput. Mater. 4 (2018) 72. https://doi.org/10.1038/s41524-018-0127-2.</w:t>
+        <w:t xml:space="preserve">3.</w:t>
+      </w:r>
+      <w:r>
+        <w:tab/>
+      </w:r>
+      <w:r>
+        <w:t xml:space="preserve">P. Giannozzi, O. Baseggio, P. Bonfà, D. Brunato, R. Car, I. Carnimeo, C. Cavazzoni, S. de Gironcoli, P. Delugas, F. Ferrari Ruffino, A. Ferretti, N. Marzari, I. Timrov, A. Urru, S. Baroni, </w:t>
+      </w:r>
+      <w:r>
+        <w:rPr>
+          <w:i/>
+          <w:iCs/>
+        </w:rPr>
+        <w:t xml:space="preserve">J. Chem. Phys.</w:t>
+      </w:r>
+      <w:r>
+        <w:t xml:space="preserve"> 2020, </w:t>
+      </w:r>
+      <w:r>
+        <w:rPr>
+          <w:i/>
+          <w:iCs/>
+        </w:rPr>
+        <w:t xml:space="preserve">152</w:t>
+      </w:r>
+      <w:r>
+        <w:t xml:space="preserve">, 154105.</w:t>
       </w:r>
     </w:p>
     <w:p>
       <w:pPr>
+        <w:tabs>
+          <w:tab w:val="left" w:pos="480"/>
+        </w:tabs>
         <w:spacing w:after="0" w:line="480" w:lineRule="auto"/>
         <w:ind w:left="480" w:hanging="480"/>
       </w:pPr>
       <w:r>
-        <w:t xml:space="preserve">[4] N. Marzari, D. Vanderbilt, A. De Vita, M. C. Payne, Thermal contraction and disordering of the Al(110) surface, Phys. Rev. Lett. 82 (1999) 3296–3299. https://doi.org/10.1103/PhysRevLett.82.3296.</w:t>
+        <w:t xml:space="preserve">4.</w:t>
+      </w:r>
+      <w:r>
+        <w:tab/>
+      </w:r>
+      <w:r>
+        <w:t xml:space="preserve">J. P. Perdew, K. Burke, M. Ernzerhof, </w:t>
+      </w:r>
+      <w:r>
+        <w:rPr>
+          <w:i/>
+          <w:iCs/>
+        </w:rPr>
+        <w:t xml:space="preserve">Phys. Rev. Lett.</w:t>
+      </w:r>
+      <w:r>
+        <w:t xml:space="preserve"> 1996, </w:t>
+      </w:r>
+      <w:r>
+        <w:rPr>
+          <w:i/>
+          <w:iCs/>
+        </w:rPr>
+        <w:t xml:space="preserve">77</w:t>
+      </w:r>
+      <w:r>
+        <w:t xml:space="preserve">, 3865–3868.</w:t>
       </w:r>
     </w:p>
     <w:p>
       <w:pPr>
+        <w:tabs>
+          <w:tab w:val="left" w:pos="480"/>
+        </w:tabs>
         <w:spacing w:after="0" w:line="480" w:lineRule="auto"/>
         <w:ind w:left="480" w:hanging="480"/>
       </w:pPr>
       <w:r>
-        <w:t xml:space="preserve">[5] B. M. Wood, M. Dzamba, X. Fu, M. Gao, M. Shuaibi, et al., UMA: A family of universal models for atoms, Adv. Neural Inf. Process. Syst. 38 (2025); arXiv:2506.23971.</w:t>
+        <w:t xml:space="preserve">5.</w:t>
+      </w:r>
+      <w:r>
+        <w:tab/>
+      </w:r>
+      <w:r>
+        <w:t xml:space="preserve">G. Prandini, A. Marrazzo, I. E. Castelli, N. Mounet, N. Marzari, </w:t>
+      </w:r>
+      <w:r>
+        <w:rPr>
+          <w:i/>
+          <w:iCs/>
+        </w:rPr>
+        <w:t xml:space="preserve">npj Comput. Mater.</w:t>
+      </w:r>
+      <w:r>
+        <w:t xml:space="preserve"> 2018, </w:t>
+      </w:r>
+      <w:r>
+        <w:rPr>
+          <w:i/>
+          <w:iCs/>
+        </w:rPr>
+        <w:t xml:space="preserve">4</w:t>
+      </w:r>
+      <w:r>
+        <w:t xml:space="preserve">, 72.</w:t>
       </w:r>
     </w:p>
     <w:p>
       <w:pPr>
+        <w:tabs>
+          <w:tab w:val="left" w:pos="480"/>
+        </w:tabs>
         <w:spacing w:after="0" w:line="480" w:lineRule="auto"/>
         <w:ind w:left="480" w:hanging="480"/>
       </w:pPr>
       <w:r>
-        <w:t xml:space="preserve">[6] F. Birch, Finite elastic strain of cubic crystals, Phys. Rev. 71 (1947) 809–824. https://doi.org/10.1103/PhysRev.71.809.</w:t>
+        <w:t xml:space="preserve">6.</w:t>
+      </w:r>
+      <w:r>
+        <w:tab/>
+      </w:r>
+      <w:r>
+        <w:t xml:space="preserve">N. Marzari, D. Vanderbilt, A. De Vita, M. C. Payne, </w:t>
+      </w:r>
+      <w:r>
+        <w:rPr>
+          <w:i/>
+          <w:iCs/>
+        </w:rPr>
+        <w:t xml:space="preserve">Phys. Rev. Lett.</w:t>
+      </w:r>
+      <w:r>
+        <w:t xml:space="preserve"> 1999, </w:t>
+      </w:r>
+      <w:r>
+        <w:rPr>
+          <w:i/>
+          <w:iCs/>
+        </w:rPr>
+        <w:t xml:space="preserve">82</w:t>
+      </w:r>
+      <w:r>
+        <w:t xml:space="preserve">, 3296–3299.</w:t>
       </w:r>
     </w:p>
     <w:p>
       <w:pPr>
+        <w:tabs>
+          <w:tab w:val="left" w:pos="480"/>
+        </w:tabs>
         <w:spacing w:after="0" w:line="480" w:lineRule="auto"/>
         <w:ind w:left="480" w:hanging="480"/>
       </w:pPr>
       <w:r>
-        <w:t xml:space="preserve">[7] A. H. Larsen, J. J. Mortensen, J. Blomqvist, I. E. Castelli, R. Christensen, M. Dułak, J. Friis, M. N. Groves, B. Hammer, C. Hargus, E. D. Hermes, P. C. Jennings, P. B. Jensen, J. Kermode, J. R. Kitchin, E. L. Kolsbjerg, J. Kubal, K. Kaasbjerg, S. Lysgaard, J. B. Maronsson, T. Maxson, T. Olsen, L. Pastewka, A. Peterson, C. Rostgaard, J. Schiøtz, O. Schütt, M. Strange, K. S. Thygesen, T. Vegge, L. Vilhelmsen, M. Walter, Z. Zeng, K. W. Jacobsen, The atomic simulation environment—a Python library for working with atoms, J. Phys.: Condens. Matter 29 (2017) 273002. https://doi.org/10.1088/1361-648X/aa680e.</w:t>
+        <w:t xml:space="preserve">7.</w:t>
+      </w:r>
+      <w:r>
+        <w:tab/>
+      </w:r>
+      <w:r>
+        <w:t xml:space="preserve">B. M. Wood, M. Dzamba, X. Fu, M. Gao, M. Shuaibi, L. Barroso-Luque, K. Abdelmaqsoud, V. Gharakhanyan, J. R. Kitchin, D. S. Levine, K. Michel, A. Sriram, T. Cohen, A. Das, A. Rizvi, S. J. Sahoo, Z. W. Ulissi, C. L. Zitnick, </w:t>
+      </w:r>
+      <w:r>
+        <w:rPr>
+          <w:i/>
+          <w:iCs/>
+        </w:rPr>
+        <w:t xml:space="preserve">arXiv</w:t>
+      </w:r>
+      <w:r>
+        <w:t xml:space="preserve"> 2025, arXiv:2506.23971.</w:t>
       </w:r>
     </w:p>
     <w:p>
       <w:pPr>
+        <w:tabs>
+          <w:tab w:val="left" w:pos="480"/>
+        </w:tabs>
         <w:spacing w:after="0" w:line="480" w:lineRule="auto"/>
         <w:ind w:left="480" w:hanging="480"/>
       </w:pPr>
       <w:r>
-        <w:t xml:space="preserve">[8] R. P. Rao, S. Adams, Studies of lithium argyrodite solid electrolytes for all-solid-state batteries, Phys. Status Solidi A 208 (2011) 1804–1807. https://doi.org/10.1002/pssa.201001117.</w:t>
+        <w:t xml:space="preserve">8.</w:t>
+      </w:r>
+      <w:r>
+        <w:tab/>
+      </w:r>
+      <w:r>
+        <w:t xml:space="preserve">F. Birch, </w:t>
+      </w:r>
+      <w:r>
+        <w:rPr>
+          <w:i/>
+          <w:iCs/>
+        </w:rPr>
+        <w:t xml:space="preserve">Phys. Rev.</w:t>
+      </w:r>
+      <w:r>
+        <w:t xml:space="preserve"> 1947, </w:t>
+      </w:r>
+      <w:r>
+        <w:rPr>
+          <w:i/>
+          <w:iCs/>
+        </w:rPr>
+        <w:t xml:space="preserve">71</w:t>
+      </w:r>
+      <w:r>
+        <w:t xml:space="preserve">, 809–824.</w:t>
       </w:r>
     </w:p>
     <w:p>
       <w:pPr>
+        <w:tabs>
+          <w:tab w:val="left" w:pos="480"/>
+        </w:tabs>
         <w:spacing w:after="0" w:line="480" w:lineRule="auto"/>
         <w:ind w:left="480" w:hanging="480"/>
       </w:pPr>
       <w:r>
-        <w:t xml:space="preserve">[9] H. Chen, S. Adams, Bond softness sensitive bond-valence parameters for crystal structure plausibility tests, IUCrJ 4 (2017) 614–625. https://doi.org/10.1107/S2052252517010211.</w:t>
+        <w:t xml:space="preserve">9.</w:t>
+      </w:r>
+      <w:r>
+        <w:tab/>
+      </w:r>
+      <w:r>
+        <w:t xml:space="preserve">A. H. Larsen, J. J. Mortensen, J. Blomqvist, I. E. Castelli, R. Christensen, M. Dułak, J. Friis, M. N. Groves, B. Hammer, C. Hargus, E. D. Hermes, P. C. Jennings, P. B. Jensen, J. Kermode, J. R. Kitchin, E. L. Kolsbjerg, J. Kubal, K. Kaasbjerg, S. Lysgaard, J. B. Maronsson, T. Maxson, T. Olsen, L. Pastewka, A. Peterson, C. Rostgaard, J. Schiøtz, O. Schütt, M. Strange, K. S. Thygesen, T. Vegge, L. Vilhelmsen, M. Walter, Z. Zeng, K. W. Jacobsen, </w:t>
+      </w:r>
+      <w:r>
+        <w:rPr>
+          <w:i/>
+          <w:iCs/>
+        </w:rPr>
+        <w:t xml:space="preserve">J. Phys.: Condens. Matter</w:t>
+      </w:r>
+      <w:r>
+        <w:t xml:space="preserve"> 2017, </w:t>
+      </w:r>
+      <w:r>
+        <w:rPr>
+          <w:i/>
+          <w:iCs/>
+        </w:rPr>
+        <w:t xml:space="preserve">29</w:t>
+      </w:r>
+      <w:r>
+        <w:t xml:space="preserve">, 273002.</w:t>
       </w:r>
     </w:p>
     <w:p>
       <w:pPr>
+        <w:tabs>
+          <w:tab w:val="left" w:pos="480"/>
+        </w:tabs>
         <w:spacing w:after="0" w:line="480" w:lineRule="auto"/>
         <w:ind w:left="480" w:hanging="480"/>
       </w:pPr>
       <w:r>
-        <w:t xml:space="preserve">[10] M. Kawamura, Y. Gohda, S. Tsuneyuki, Improved tetrahedron method for the Brillouin-zone integration applicable to response functions, Phys. Rev. B 89 (2014) 094515. https://doi.org/10.1103/PhysRevB.89.094515.</w:t>
+        <w:t xml:space="preserve">10.</w:t>
+      </w:r>
+      <w:r>
+        <w:tab/>
+      </w:r>
+      <w:r>
+        <w:t xml:space="preserve">R. P. Rao, S. Adams, </w:t>
+      </w:r>
+      <w:r>
+        <w:rPr>
+          <w:i/>
+          <w:iCs/>
+        </w:rPr>
+        <w:t xml:space="preserve">Phys. Status Solidi A</w:t>
+      </w:r>
+      <w:r>
+        <w:t xml:space="preserve"> 2011, </w:t>
+      </w:r>
+      <w:r>
+        <w:rPr>
+          <w:i/>
+          <w:iCs/>
+        </w:rPr>
+        <w:t xml:space="preserve">208</w:t>
+      </w:r>
+      <w:r>
+        <w:t xml:space="preserve">, 1804–1807.</w:t>
       </w:r>
     </w:p>
     <w:p>
       <w:pPr>
+        <w:tabs>
+          <w:tab w:val="left" w:pos="480"/>
+        </w:tabs>
         <w:spacing w:after="0" w:line="480" w:lineRule="auto"/>
         <w:ind w:left="480" w:hanging="480"/>
       </w:pPr>
       <w:r>
-        <w:t xml:space="preserve">[11] A. D. Becke, K. E. Edgecombe, A simple measure of electron localization in atomic and molecular systems, J. Chem. Phys. 92 (1990) 5397–5403. https://doi.org/10.1063/1.458517.</w:t>
+        <w:t xml:space="preserve">11.</w:t>
+      </w:r>
+      <w:r>
+        <w:tab/>
+      </w:r>
+      <w:r>
+        <w:t xml:space="preserve">H. Chen, S. Adams, </w:t>
+      </w:r>
+      <w:r>
+        <w:rPr>
+          <w:i/>
+          <w:iCs/>
+        </w:rPr>
+        <w:t xml:space="preserve">IUCrJ</w:t>
+      </w:r>
+      <w:r>
+        <w:t xml:space="preserve"> 2017, </w:t>
+      </w:r>
+      <w:r>
+        <w:rPr>
+          <w:i/>
+          <w:iCs/>
+        </w:rPr>
+        <w:t xml:space="preserve">4</w:t>
+      </w:r>
+      <w:r>
+        <w:t xml:space="preserve">, 614–625.</w:t>
       </w:r>
     </w:p>
     <w:p>
       <w:pPr>
+        <w:tabs>
+          <w:tab w:val="left" w:pos="480"/>
+        </w:tabs>
         <w:spacing w:after="0" w:line="480" w:lineRule="auto"/>
         <w:ind w:left="480" w:hanging="480"/>
       </w:pPr>
       <w:r>
-        <w:t xml:space="preserve">[12] R. Dronskowski, P. E. Blöchl, Crystal orbital Hamilton populations (COHP): energy-resolved visualization of chemical bonding in solids based on density-functional calculations, J. Phys. Chem. 97 (1993) 8617–8624. https://doi.org/10.1021/j100135a014.</w:t>
+        <w:t xml:space="preserve">12.</w:t>
+      </w:r>
+      <w:r>
+        <w:tab/>
+      </w:r>
+      <w:r>
+        <w:t xml:space="preserve">M. Kawamura, Y. Gohda, S. Tsuneyuki, </w:t>
+      </w:r>
+      <w:r>
+        <w:rPr>
+          <w:i/>
+          <w:iCs/>
+        </w:rPr>
+        <w:t xml:space="preserve">Phys. Rev. B</w:t>
+      </w:r>
+      <w:r>
+        <w:t xml:space="preserve"> 2014, </w:t>
+      </w:r>
+      <w:r>
+        <w:rPr>
+          <w:i/>
+          <w:iCs/>
+        </w:rPr>
+        <w:t xml:space="preserve">89</w:t>
+      </w:r>
+      <w:r>
+        <w:t xml:space="preserve">, 094515.</w:t>
       </w:r>
     </w:p>
     <w:p>
       <w:pPr>
+        <w:tabs>
+          <w:tab w:val="left" w:pos="480"/>
+        </w:tabs>
         <w:spacing w:after="0" w:line="480" w:lineRule="auto"/>
         <w:ind w:left="480" w:hanging="480"/>
       </w:pPr>
       <w:r>
-        <w:t xml:space="preserve">[13] S. Maintz, V. L. Deringer, A. L. Tchougréeff, R. Dronskowski, LOBSTER: A tool to extract chemical bonding from plane-wave based DFT, J. Comput. Chem. 37 (2016) 1030–1035. https://doi.org/10.1002/jcc.24300.</w:t>
+        <w:t xml:space="preserve">13.</w:t>
+      </w:r>
+      <w:r>
+        <w:tab/>
+      </w:r>
+      <w:r>
+        <w:t xml:space="preserve">A. D. Becke, K. E. Edgecombe, </w:t>
+      </w:r>
+      <w:r>
+        <w:rPr>
+          <w:i/>
+          <w:iCs/>
+        </w:rPr>
+        <w:t xml:space="preserve">J. Chem. Phys.</w:t>
+      </w:r>
+      <w:r>
+        <w:t xml:space="preserve"> 1990, </w:t>
+      </w:r>
+      <w:r>
+        <w:rPr>
+          <w:i/>
+          <w:iCs/>
+        </w:rPr>
+        <w:t xml:space="preserve">92</w:t>
+      </w:r>
+      <w:r>
+        <w:t xml:space="preserve">, 5397–5403.</w:t>
       </w:r>
     </w:p>
     <w:p>
       <w:pPr>
+        <w:tabs>
+          <w:tab w:val="left" w:pos="480"/>
+        </w:tabs>
         <w:spacing w:after="0" w:line="480" w:lineRule="auto"/>
         <w:ind w:left="480" w:hanging="480"/>
       </w:pPr>
       <w:r>
-        <w:t xml:space="preserve">[14] R. Nelson, C. Ertural, J. George, V. L. Deringer, G. Hautier, R. Dronskowski, LOBSTER: Local orbital projections, atomic charges, and chemical-bonding analysis from projector-augmented-wave-based density-functional theory, J. Comput. Chem. 41 (2020) 1931–1940. https://doi.org/10.1002/jcc.26353.</w:t>
+        <w:t xml:space="preserve">14.</w:t>
+      </w:r>
+      <w:r>
+        <w:tab/>
+      </w:r>
+      <w:r>
+        <w:t xml:space="preserve">R. Dronskowski, P. E. Blöchl, </w:t>
+      </w:r>
+      <w:r>
+        <w:rPr>
+          <w:i/>
+          <w:iCs/>
+        </w:rPr>
+        <w:t xml:space="preserve">J. Phys. Chem.</w:t>
+      </w:r>
+      <w:r>
+        <w:t xml:space="preserve"> 1993, </w:t>
+      </w:r>
+      <w:r>
+        <w:rPr>
+          <w:i/>
+          <w:iCs/>
+        </w:rPr>
+        <w:t xml:space="preserve">97</w:t>
+      </w:r>
+      <w:r>
+        <w:t xml:space="preserve">, 8617–8624.</w:t>
       </w:r>
     </w:p>
     <w:p>
       <w:pPr>
+        <w:tabs>
+          <w:tab w:val="left" w:pos="480"/>
+        </w:tabs>
         <w:spacing w:after="0" w:line="480" w:lineRule="auto"/>
         <w:ind w:left="480" w:hanging="480"/>
       </w:pPr>
       <w:r>
-        <w:t xml:space="preserve">[15] A. Dal Corso, Pseudopotentials periodic table: From H to Pu, Comput. Mater. Sci. 95 (2014) 337–350. https://doi.org/10.1016/j.commatsci.2014.07.043.</w:t>
+        <w:t xml:space="preserve">15.</w:t>
+      </w:r>
+      <w:r>
+        <w:tab/>
+      </w:r>
+      <w:r>
+        <w:t xml:space="preserve">S. Maintz, V. L. Deringer, A. L. Tchougréeff, R. Dronskowski, </w:t>
+      </w:r>
+      <w:r>
+        <w:rPr>
+          <w:i/>
+          <w:iCs/>
+        </w:rPr>
+        <w:t xml:space="preserve">J. Comput. Chem.</w:t>
+      </w:r>
+      <w:r>
+        <w:t xml:space="preserve"> 2016, </w:t>
+      </w:r>
+      <w:r>
+        <w:rPr>
+          <w:i/>
+          <w:iCs/>
+        </w:rPr>
+        <w:t xml:space="preserve">37</w:t>
+      </w:r>
+      <w:r>
+        <w:t xml:space="preserve">, 1030–1035.</w:t>
+      </w:r>
+    </w:p>
+    <w:p>
+      <w:pPr>
+        <w:tabs>
+          <w:tab w:val="left" w:pos="480"/>
+        </w:tabs>
+        <w:spacing w:after="0" w:line="480" w:lineRule="auto"/>
+        <w:ind w:left="480" w:hanging="480"/>
+      </w:pPr>
+      <w:r>
+        <w:t xml:space="preserve">16.</w:t>
+      </w:r>
+      <w:r>
+        <w:tab/>
+      </w:r>
+      <w:r>
+        <w:t xml:space="preserve">R. Nelson, C. Ertural, J. George, V. L. Deringer, G. Hautier, R. Dronskowski, </w:t>
+      </w:r>
+      <w:r>
+        <w:rPr>
+          <w:i/>
+          <w:iCs/>
+        </w:rPr>
+        <w:t xml:space="preserve">J. Comput. Chem.</w:t>
+      </w:r>
+      <w:r>
+        <w:t xml:space="preserve"> 2020, </w:t>
+      </w:r>
+      <w:r>
+        <w:rPr>
+          <w:i/>
+          <w:iCs/>
+        </w:rPr>
+        <w:t xml:space="preserve">41</w:t>
+      </w:r>
+      <w:r>
+        <w:t xml:space="preserve">, 1931–1940.</w:t>
+      </w:r>
+    </w:p>
+    <w:p>
+      <w:pPr>
+        <w:tabs>
+          <w:tab w:val="left" w:pos="480"/>
+        </w:tabs>
+        <w:spacing w:after="0" w:line="480" w:lineRule="auto"/>
+        <w:ind w:left="480" w:hanging="480"/>
+      </w:pPr>
+      <w:r>
+        <w:t xml:space="preserve">17.</w:t>
+      </w:r>
+      <w:r>
+        <w:tab/>
+      </w:r>
+      <w:r>
+        <w:t xml:space="preserve">A. Dal Corso, </w:t>
+      </w:r>
+      <w:r>
+        <w:rPr>
+          <w:i/>
+          <w:iCs/>
+        </w:rPr>
+        <w:t xml:space="preserve">Comput. Mater. Sci.</w:t>
+      </w:r>
+      <w:r>
+        <w:t xml:space="preserve"> 2014, </w:t>
+      </w:r>
+      <w:r>
+        <w:rPr>
+          <w:i/>
+          <w:iCs/>
+        </w:rPr>
+        <w:t xml:space="preserve">95</w:t>
+      </w:r>
+      <w:r>
+        <w:t xml:space="preserve">, 337–350.</w:t>
       </w:r>
     </w:p>
     <w:sectPr>

</xml_diff>

<commit_message>
B2O3 Methods: cite the SSSP source libraries (GBRV, PSlibrary)
Adds the GBRV paper and moves the PSlibrary paper up so the pseudopotential
sentence cites SSSP together with the libraries the files came from
(Li, B, S, Cl from GBRV; P, O from PSlibrary, as read from the backup
inputs). The list grows to 18 and later citations shift by two. Word file,
md copy and Docs version carry the same numbering.

Co-Authored-By: Claude Opus 5.5 <noreply@anthropic.com>
Claude-Session: https://claude.ai/code/session_01QtbBQvJTvwH5CtkzA6CTzs
</commit_message>
<xml_diff>
--- a/kb/papers/b2o3_bo_lpsc16_methods_2026_10_20.docx
+++ b/kb/papers/b2o3_bo_lpsc16_methods_2026_10_20.docx
@@ -35,7 +35,7 @@
         <w:rPr>
           <w:vertAlign w:val="superscript"/>
         </w:rPr>
-        <w:t xml:space="preserve">[5]</w:t>
+        <w:t xml:space="preserve">[5–7]</w:t>
       </w:r>
       <w:r>
         <w:t xml:space="preserve"> The Brillouin zone was sampled with Γ-centered Monkhorst–Pack grids, and Marzari–Vanderbilt smearing of 0.01 Ry was applied.</w:t>
@@ -44,7 +44,7 @@
         <w:rPr>
           <w:vertAlign w:val="superscript"/>
         </w:rPr>
-        <w:t xml:space="preserve">[6]</w:t>
+        <w:t xml:space="preserve">[8]</w:t>
       </w:r>
       <w:r>
         <w:t xml:space="preserve"> Ionic positions were relaxed until all force components fell below 10</w:t>
@@ -182,7 +182,7 @@
         <w:rPr>
           <w:vertAlign w:val="superscript"/>
         </w:rPr>
-        <w:t xml:space="preserve">[7]</w:t>
+        <w:t xml:space="preserve">[9]</w:t>
       </w:r>
       <w:r>
         <w:t xml:space="preserve"> the 45 distributions of S</w:t>
@@ -586,7 +586,7 @@
         <w:rPr>
           <w:vertAlign w:val="superscript"/>
         </w:rPr>
-        <w:t xml:space="preserve">[8]</w:t>
+        <w:t xml:space="preserve">[10]</w:t>
       </w:r>
       <w:r>
         <w:t xml:space="preserve"> and the ions were finally relaxed at </w:t>
@@ -629,7 +629,7 @@
         <w:rPr>
           <w:vertAlign w:val="superscript"/>
         </w:rPr>
-        <w:t xml:space="preserve">[7,9]</w:t>
+        <w:t xml:space="preserve">[9,11]</w:t>
       </w:r>
       <w:r>
         <w:t xml:space="preserve"> The </w:t>
@@ -1066,7 +1066,7 @@
         <w:rPr>
           <w:vertAlign w:val="superscript"/>
         </w:rPr>
-        <w:t xml:space="preserve">[10,11]</w:t>
+        <w:t xml:space="preserve">[12,13]</w:t>
       </w:r>
       <w:r>
         <w:t xml:space="preserve"> On a grid with ~0.25 Å spacing, the bond valence sum of a Li</w:t>
@@ -1390,7 +1390,7 @@
         <w:rPr>
           <w:vertAlign w:val="superscript"/>
         </w:rPr>
-        <w:t xml:space="preserve">[12]</w:t>
+        <w:t xml:space="preserve">[14]</w:t>
       </w:r>
       <w:r>
         <w:t xml:space="preserve"> and were broadened with a 0.05 eV Gaussian for display. Energies were referenced to the valence band maximum (VBM), which was taken from the Kohn–Sham eigenvalues of a fixed-occupation calculation. The electron localization function (ELF) was calculated from the SCF valence density,</w:t>
@@ -1399,7 +1399,7 @@
         <w:rPr>
           <w:vertAlign w:val="superscript"/>
         </w:rPr>
-        <w:t xml:space="preserve">[13]</w:t>
+        <w:t xml:space="preserve">[15]</w:t>
       </w:r>
       <w:r>
         <w:t xml:space="preserve"> and its value at the bond midpoint was averaged over all bonds of each type (bonds identified within 2.15, 1.9, 2.3, 2.9, and 2.95 Å for B–S, P–O, P–S, Li–S, and Li–Cl, respectively).</w:t>
@@ -1417,7 +1417,7 @@
         <w:rPr>
           <w:vertAlign w:val="superscript"/>
         </w:rPr>
-        <w:t xml:space="preserve">[14]</w:t>
+        <w:t xml:space="preserve">[16]</w:t>
       </w:r>
       <w:r>
         <w:t xml:space="preserve"> was performed with LOBSTER 5.1.1.</w:t>
@@ -1426,7 +1426,7 @@
         <w:rPr>
           <w:vertAlign w:val="superscript"/>
         </w:rPr>
-        <w:t xml:space="preserve">[15,16]</w:t>
+        <w:t xml:space="preserve">[17,18]</w:t>
       </w:r>
       <w:r>
         <w:t xml:space="preserve"> Because LOBSTER requires PAW wavefunctions, the SCF and non-self-consistent (no symmetry, 960 bands) calculations were repeated on the same structure with PAW datasets from PSlibrary,</w:t>
@@ -1435,7 +1435,7 @@
         <w:rPr>
           <w:vertAlign w:val="superscript"/>
         </w:rPr>
-        <w:t xml:space="preserve">[17]</w:t>
+        <w:t xml:space="preserve">[7]</w:t>
       </w:r>
       <w:r>
         <w:t xml:space="preserve"> and the wavefunctions were projected onto the pbeVaspFit2015 basis (Li 1</w:t>
@@ -1744,27 +1744,27 @@
         <w:tab/>
       </w:r>
       <w:r>
-        <w:t xml:space="preserve">N. Marzari, D. Vanderbilt, A. De Vita, M. C. Payne, </w:t>
-      </w:r>
-      <w:r>
-        <w:rPr>
-          <w:i/>
-          <w:iCs/>
-        </w:rPr>
-        <w:t xml:space="preserve">Phys. Rev. Lett.</w:t>
-      </w:r>
-      <w:r>
-        <w:t xml:space="preserve"> 1999, </w:t>
-      </w:r>
-      <w:r>
-        <w:rPr>
-          <w:i/>
-          <w:iCs/>
-        </w:rPr>
-        <w:t xml:space="preserve">82</w:t>
-      </w:r>
-      <w:r>
-        <w:t xml:space="preserve">, 3296–3299.</w:t>
+        <w:t xml:space="preserve">K. F. Garrity, J. W. Bennett, K. M. Rabe, D. Vanderbilt, </w:t>
+      </w:r>
+      <w:r>
+        <w:rPr>
+          <w:i/>
+          <w:iCs/>
+        </w:rPr>
+        <w:t xml:space="preserve">Comput. Mater. Sci.</w:t>
+      </w:r>
+      <w:r>
+        <w:t xml:space="preserve"> 2014, </w:t>
+      </w:r>
+      <w:r>
+        <w:rPr>
+          <w:i/>
+          <w:iCs/>
+        </w:rPr>
+        <w:t xml:space="preserve">81</w:t>
+      </w:r>
+      <w:r>
+        <w:t xml:space="preserve">, 446–452.</w:t>
       </w:r>
     </w:p>
     <w:p>
@@ -1782,17 +1782,27 @@
         <w:tab/>
       </w:r>
       <w:r>
-        <w:t xml:space="preserve">B. M. Wood, M. Dzamba, X. Fu, M. Gao, M. Shuaibi, L. Barroso-Luque, K. Abdelmaqsoud, V. Gharakhanyan, J. R. Kitchin, D. S. Levine, K. Michel, A. Sriram, T. Cohen, A. Das, A. Rizvi, S. J. Sahoo, Z. W. Ulissi, C. L. Zitnick, </w:t>
-      </w:r>
-      <w:r>
-        <w:rPr>
-          <w:i/>
-          <w:iCs/>
-        </w:rPr>
-        <w:t xml:space="preserve">arXiv</w:t>
-      </w:r>
-      <w:r>
-        <w:t xml:space="preserve"> 2025, arXiv:2506.23971.</w:t>
+        <w:t xml:space="preserve">A. Dal Corso, </w:t>
+      </w:r>
+      <w:r>
+        <w:rPr>
+          <w:i/>
+          <w:iCs/>
+        </w:rPr>
+        <w:t xml:space="preserve">Comput. Mater. Sci.</w:t>
+      </w:r>
+      <w:r>
+        <w:t xml:space="preserve"> 2014, </w:t>
+      </w:r>
+      <w:r>
+        <w:rPr>
+          <w:i/>
+          <w:iCs/>
+        </w:rPr>
+        <w:t xml:space="preserve">95</w:t>
+      </w:r>
+      <w:r>
+        <w:t xml:space="preserve">, 337–350.</w:t>
       </w:r>
     </w:p>
     <w:p>
@@ -1810,27 +1820,27 @@
         <w:tab/>
       </w:r>
       <w:r>
-        <w:t xml:space="preserve">F. Birch, </w:t>
-      </w:r>
-      <w:r>
-        <w:rPr>
-          <w:i/>
-          <w:iCs/>
-        </w:rPr>
-        <w:t xml:space="preserve">Phys. Rev.</w:t>
-      </w:r>
-      <w:r>
-        <w:t xml:space="preserve"> 1947, </w:t>
-      </w:r>
-      <w:r>
-        <w:rPr>
-          <w:i/>
-          <w:iCs/>
-        </w:rPr>
-        <w:t xml:space="preserve">71</w:t>
-      </w:r>
-      <w:r>
-        <w:t xml:space="preserve">, 809–824.</w:t>
+        <w:t xml:space="preserve">N. Marzari, D. Vanderbilt, A. De Vita, M. C. Payne, </w:t>
+      </w:r>
+      <w:r>
+        <w:rPr>
+          <w:i/>
+          <w:iCs/>
+        </w:rPr>
+        <w:t xml:space="preserve">Phys. Rev. Lett.</w:t>
+      </w:r>
+      <w:r>
+        <w:t xml:space="preserve"> 1999, </w:t>
+      </w:r>
+      <w:r>
+        <w:rPr>
+          <w:i/>
+          <w:iCs/>
+        </w:rPr>
+        <w:t xml:space="preserve">82</w:t>
+      </w:r>
+      <w:r>
+        <w:t xml:space="preserve">, 3296–3299.</w:t>
       </w:r>
     </w:p>
     <w:p>
@@ -1848,27 +1858,17 @@
         <w:tab/>
       </w:r>
       <w:r>
-        <w:t xml:space="preserve">A. H. Larsen, J. J. Mortensen, J. Blomqvist, I. E. Castelli, R. Christensen, M. Dułak, J. Friis, M. N. Groves, B. Hammer, C. Hargus, E. D. Hermes, P. C. Jennings, P. B. Jensen, J. Kermode, J. R. Kitchin, E. L. Kolsbjerg, J. Kubal, K. Kaasbjerg, S. Lysgaard, J. B. Maronsson, T. Maxson, T. Olsen, L. Pastewka, A. Peterson, C. Rostgaard, J. Schiøtz, O. Schütt, M. Strange, K. S. Thygesen, T. Vegge, L. Vilhelmsen, M. Walter, Z. Zeng, K. W. Jacobsen, </w:t>
-      </w:r>
-      <w:r>
-        <w:rPr>
-          <w:i/>
-          <w:iCs/>
-        </w:rPr>
-        <w:t xml:space="preserve">J. Phys.: Condens. Matter</w:t>
-      </w:r>
-      <w:r>
-        <w:t xml:space="preserve"> 2017, </w:t>
-      </w:r>
-      <w:r>
-        <w:rPr>
-          <w:i/>
-          <w:iCs/>
-        </w:rPr>
-        <w:t xml:space="preserve">29</w:t>
-      </w:r>
-      <w:r>
-        <w:t xml:space="preserve">, 273002.</w:t>
+        <w:t xml:space="preserve">B. M. Wood, M. Dzamba, X. Fu, M. Gao, M. Shuaibi, L. Barroso-Luque, K. Abdelmaqsoud, V. Gharakhanyan, J. R. Kitchin, D. S. Levine, K. Michel, A. Sriram, T. Cohen, A. Das, A. Rizvi, S. J. Sahoo, Z. W. Ulissi, C. L. Zitnick, </w:t>
+      </w:r>
+      <w:r>
+        <w:rPr>
+          <w:i/>
+          <w:iCs/>
+        </w:rPr>
+        <w:t xml:space="preserve">arXiv</w:t>
+      </w:r>
+      <w:r>
+        <w:t xml:space="preserve"> 2025, arXiv:2506.23971.</w:t>
       </w:r>
     </w:p>
     <w:p>
@@ -1886,27 +1886,27 @@
         <w:tab/>
       </w:r>
       <w:r>
-        <w:t xml:space="preserve">R. P. Rao, S. Adams, </w:t>
-      </w:r>
-      <w:r>
-        <w:rPr>
-          <w:i/>
-          <w:iCs/>
-        </w:rPr>
-        <w:t xml:space="preserve">Phys. Status Solidi A</w:t>
-      </w:r>
-      <w:r>
-        <w:t xml:space="preserve"> 2011, </w:t>
-      </w:r>
-      <w:r>
-        <w:rPr>
-          <w:i/>
-          <w:iCs/>
-        </w:rPr>
-        <w:t xml:space="preserve">208</w:t>
-      </w:r>
-      <w:r>
-        <w:t xml:space="preserve">, 1804–1807.</w:t>
+        <w:t xml:space="preserve">F. Birch, </w:t>
+      </w:r>
+      <w:r>
+        <w:rPr>
+          <w:i/>
+          <w:iCs/>
+        </w:rPr>
+        <w:t xml:space="preserve">Phys. Rev.</w:t>
+      </w:r>
+      <w:r>
+        <w:t xml:space="preserve"> 1947, </w:t>
+      </w:r>
+      <w:r>
+        <w:rPr>
+          <w:i/>
+          <w:iCs/>
+        </w:rPr>
+        <w:t xml:space="preserve">71</w:t>
+      </w:r>
+      <w:r>
+        <w:t xml:space="preserve">, 809–824.</w:t>
       </w:r>
     </w:p>
     <w:p>
@@ -1924,14 +1924,14 @@
         <w:tab/>
       </w:r>
       <w:r>
-        <w:t xml:space="preserve">H. Chen, S. Adams, </w:t>
-      </w:r>
-      <w:r>
-        <w:rPr>
-          <w:i/>
-          <w:iCs/>
-        </w:rPr>
-        <w:t xml:space="preserve">IUCrJ</w:t>
+        <w:t xml:space="preserve">A. H. Larsen, J. J. Mortensen, J. Blomqvist, I. E. Castelli, R. Christensen, M. Dułak, J. Friis, M. N. Groves, B. Hammer, C. Hargus, E. D. Hermes, P. C. Jennings, P. B. Jensen, J. Kermode, J. R. Kitchin, E. L. Kolsbjerg, J. Kubal, K. Kaasbjerg, S. Lysgaard, J. B. Maronsson, T. Maxson, T. Olsen, L. Pastewka, A. Peterson, C. Rostgaard, J. Schiøtz, O. Schütt, M. Strange, K. S. Thygesen, T. Vegge, L. Vilhelmsen, M. Walter, Z. Zeng, K. W. Jacobsen, </w:t>
+      </w:r>
+      <w:r>
+        <w:rPr>
+          <w:i/>
+          <w:iCs/>
+        </w:rPr>
+        <w:t xml:space="preserve">J. Phys.: Condens. Matter</w:t>
       </w:r>
       <w:r>
         <w:t xml:space="preserve"> 2017, </w:t>
@@ -1941,10 +1941,10 @@
           <w:i/>
           <w:iCs/>
         </w:rPr>
-        <w:t xml:space="preserve">4</w:t>
-      </w:r>
-      <w:r>
-        <w:t xml:space="preserve">, 614–625.</w:t>
+        <w:t xml:space="preserve">29</w:t>
+      </w:r>
+      <w:r>
+        <w:t xml:space="preserve">, 273002.</w:t>
       </w:r>
     </w:p>
     <w:p>
@@ -1962,27 +1962,27 @@
         <w:tab/>
       </w:r>
       <w:r>
-        <w:t xml:space="preserve">M. Kawamura, Y. Gohda, S. Tsuneyuki, </w:t>
-      </w:r>
-      <w:r>
-        <w:rPr>
-          <w:i/>
-          <w:iCs/>
-        </w:rPr>
-        <w:t xml:space="preserve">Phys. Rev. B</w:t>
-      </w:r>
-      <w:r>
-        <w:t xml:space="preserve"> 2014, </w:t>
-      </w:r>
-      <w:r>
-        <w:rPr>
-          <w:i/>
-          <w:iCs/>
-        </w:rPr>
-        <w:t xml:space="preserve">89</w:t>
-      </w:r>
-      <w:r>
-        <w:t xml:space="preserve">, 094515.</w:t>
+        <w:t xml:space="preserve">R. P. Rao, S. Adams, </w:t>
+      </w:r>
+      <w:r>
+        <w:rPr>
+          <w:i/>
+          <w:iCs/>
+        </w:rPr>
+        <w:t xml:space="preserve">Phys. Status Solidi A</w:t>
+      </w:r>
+      <w:r>
+        <w:t xml:space="preserve"> 2011, </w:t>
+      </w:r>
+      <w:r>
+        <w:rPr>
+          <w:i/>
+          <w:iCs/>
+        </w:rPr>
+        <w:t xml:space="preserve">208</w:t>
+      </w:r>
+      <w:r>
+        <w:t xml:space="preserve">, 1804–1807.</w:t>
       </w:r>
     </w:p>
     <w:p>
@@ -2000,27 +2000,27 @@
         <w:tab/>
       </w:r>
       <w:r>
-        <w:t xml:space="preserve">A. D. Becke, K. E. Edgecombe, </w:t>
-      </w:r>
-      <w:r>
-        <w:rPr>
-          <w:i/>
-          <w:iCs/>
-        </w:rPr>
-        <w:t xml:space="preserve">J. Chem. Phys.</w:t>
-      </w:r>
-      <w:r>
-        <w:t xml:space="preserve"> 1990, </w:t>
-      </w:r>
-      <w:r>
-        <w:rPr>
-          <w:i/>
-          <w:iCs/>
-        </w:rPr>
-        <w:t xml:space="preserve">92</w:t>
-      </w:r>
-      <w:r>
-        <w:t xml:space="preserve">, 5397–5403.</w:t>
+        <w:t xml:space="preserve">H. Chen, S. Adams, </w:t>
+      </w:r>
+      <w:r>
+        <w:rPr>
+          <w:i/>
+          <w:iCs/>
+        </w:rPr>
+        <w:t xml:space="preserve">IUCrJ</w:t>
+      </w:r>
+      <w:r>
+        <w:t xml:space="preserve"> 2017, </w:t>
+      </w:r>
+      <w:r>
+        <w:rPr>
+          <w:i/>
+          <w:iCs/>
+        </w:rPr>
+        <w:t xml:space="preserve">4</w:t>
+      </w:r>
+      <w:r>
+        <w:t xml:space="preserve">, 614–625.</w:t>
       </w:r>
     </w:p>
     <w:p>
@@ -2038,27 +2038,27 @@
         <w:tab/>
       </w:r>
       <w:r>
-        <w:t xml:space="preserve">R. Dronskowski, P. E. Blöchl, </w:t>
-      </w:r>
-      <w:r>
-        <w:rPr>
-          <w:i/>
-          <w:iCs/>
-        </w:rPr>
-        <w:t xml:space="preserve">J. Phys. Chem.</w:t>
-      </w:r>
-      <w:r>
-        <w:t xml:space="preserve"> 1993, </w:t>
-      </w:r>
-      <w:r>
-        <w:rPr>
-          <w:i/>
-          <w:iCs/>
-        </w:rPr>
-        <w:t xml:space="preserve">97</w:t>
-      </w:r>
-      <w:r>
-        <w:t xml:space="preserve">, 8617–8624.</w:t>
+        <w:t xml:space="preserve">M. Kawamura, Y. Gohda, S. Tsuneyuki, </w:t>
+      </w:r>
+      <w:r>
+        <w:rPr>
+          <w:i/>
+          <w:iCs/>
+        </w:rPr>
+        <w:t xml:space="preserve">Phys. Rev. B</w:t>
+      </w:r>
+      <w:r>
+        <w:t xml:space="preserve"> 2014, </w:t>
+      </w:r>
+      <w:r>
+        <w:rPr>
+          <w:i/>
+          <w:iCs/>
+        </w:rPr>
+        <w:t xml:space="preserve">89</w:t>
+      </w:r>
+      <w:r>
+        <w:t xml:space="preserve">, 094515.</w:t>
       </w:r>
     </w:p>
     <w:p>
@@ -2076,27 +2076,27 @@
         <w:tab/>
       </w:r>
       <w:r>
-        <w:t xml:space="preserve">S. Maintz, V. L. Deringer, A. L. Tchougréeff, R. Dronskowski, </w:t>
-      </w:r>
-      <w:r>
-        <w:rPr>
-          <w:i/>
-          <w:iCs/>
-        </w:rPr>
-        <w:t xml:space="preserve">J. Comput. Chem.</w:t>
-      </w:r>
-      <w:r>
-        <w:t xml:space="preserve"> 2016, </w:t>
-      </w:r>
-      <w:r>
-        <w:rPr>
-          <w:i/>
-          <w:iCs/>
-        </w:rPr>
-        <w:t xml:space="preserve">37</w:t>
-      </w:r>
-      <w:r>
-        <w:t xml:space="preserve">, 1030–1035.</w:t>
+        <w:t xml:space="preserve">A. D. Becke, K. E. Edgecombe, </w:t>
+      </w:r>
+      <w:r>
+        <w:rPr>
+          <w:i/>
+          <w:iCs/>
+        </w:rPr>
+        <w:t xml:space="preserve">J. Chem. Phys.</w:t>
+      </w:r>
+      <w:r>
+        <w:t xml:space="preserve"> 1990, </w:t>
+      </w:r>
+      <w:r>
+        <w:rPr>
+          <w:i/>
+          <w:iCs/>
+        </w:rPr>
+        <w:t xml:space="preserve">92</w:t>
+      </w:r>
+      <w:r>
+        <w:t xml:space="preserve">, 5397–5403.</w:t>
       </w:r>
     </w:p>
     <w:p>
@@ -2114,27 +2114,27 @@
         <w:tab/>
       </w:r>
       <w:r>
-        <w:t xml:space="preserve">R. Nelson, C. Ertural, J. George, V. L. Deringer, G. Hautier, R. Dronskowski, </w:t>
-      </w:r>
-      <w:r>
-        <w:rPr>
-          <w:i/>
-          <w:iCs/>
-        </w:rPr>
-        <w:t xml:space="preserve">J. Comput. Chem.</w:t>
-      </w:r>
-      <w:r>
-        <w:t xml:space="preserve"> 2020, </w:t>
-      </w:r>
-      <w:r>
-        <w:rPr>
-          <w:i/>
-          <w:iCs/>
-        </w:rPr>
-        <w:t xml:space="preserve">41</w:t>
-      </w:r>
-      <w:r>
-        <w:t xml:space="preserve">, 1931–1940.</w:t>
+        <w:t xml:space="preserve">R. Dronskowski, P. E. Blöchl, </w:t>
+      </w:r>
+      <w:r>
+        <w:rPr>
+          <w:i/>
+          <w:iCs/>
+        </w:rPr>
+        <w:t xml:space="preserve">J. Phys. Chem.</w:t>
+      </w:r>
+      <w:r>
+        <w:t xml:space="preserve"> 1993, </w:t>
+      </w:r>
+      <w:r>
+        <w:rPr>
+          <w:i/>
+          <w:iCs/>
+        </w:rPr>
+        <w:t xml:space="preserve">97</w:t>
+      </w:r>
+      <w:r>
+        <w:t xml:space="preserve">, 8617–8624.</w:t>
       </w:r>
     </w:p>
     <w:p>
@@ -2152,27 +2152,65 @@
         <w:tab/>
       </w:r>
       <w:r>
-        <w:t xml:space="preserve">A. Dal Corso, </w:t>
-      </w:r>
-      <w:r>
-        <w:rPr>
-          <w:i/>
-          <w:iCs/>
-        </w:rPr>
-        <w:t xml:space="preserve">Comput. Mater. Sci.</w:t>
-      </w:r>
-      <w:r>
-        <w:t xml:space="preserve"> 2014, </w:t>
-      </w:r>
-      <w:r>
-        <w:rPr>
-          <w:i/>
-          <w:iCs/>
-        </w:rPr>
-        <w:t xml:space="preserve">95</w:t>
-      </w:r>
-      <w:r>
-        <w:t xml:space="preserve">, 337–350.</w:t>
+        <w:t xml:space="preserve">S. Maintz, V. L. Deringer, A. L. Tchougréeff, R. Dronskowski, </w:t>
+      </w:r>
+      <w:r>
+        <w:rPr>
+          <w:i/>
+          <w:iCs/>
+        </w:rPr>
+        <w:t xml:space="preserve">J. Comput. Chem.</w:t>
+      </w:r>
+      <w:r>
+        <w:t xml:space="preserve"> 2016, </w:t>
+      </w:r>
+      <w:r>
+        <w:rPr>
+          <w:i/>
+          <w:iCs/>
+        </w:rPr>
+        <w:t xml:space="preserve">37</w:t>
+      </w:r>
+      <w:r>
+        <w:t xml:space="preserve">, 1030–1035.</w:t>
+      </w:r>
+    </w:p>
+    <w:p>
+      <w:pPr>
+        <w:tabs>
+          <w:tab w:val="left" w:pos="480"/>
+        </w:tabs>
+        <w:spacing w:after="0" w:line="480" w:lineRule="auto"/>
+        <w:ind w:left="480" w:hanging="480"/>
+      </w:pPr>
+      <w:r>
+        <w:t xml:space="preserve">18.</w:t>
+      </w:r>
+      <w:r>
+        <w:tab/>
+      </w:r>
+      <w:r>
+        <w:t xml:space="preserve">R. Nelson, C. Ertural, J. George, V. L. Deringer, G. Hautier, R. Dronskowski, </w:t>
+      </w:r>
+      <w:r>
+        <w:rPr>
+          <w:i/>
+          <w:iCs/>
+        </w:rPr>
+        <w:t xml:space="preserve">J. Comput. Chem.</w:t>
+      </w:r>
+      <w:r>
+        <w:t xml:space="preserve"> 2020, </w:t>
+      </w:r>
+      <w:r>
+        <w:rPr>
+          <w:i/>
+          <w:iCs/>
+        </w:rPr>
+        <w:t xml:space="preserve">41</w:t>
+      </w:r>
+      <w:r>
+        <w:t xml:space="preserve">, 1931–1940.</w:t>
       </w:r>
     </w:p>
     <w:sectPr>

</xml_diff>

<commit_message>
B2O3 Methods sentence 3: cite Monkhorst-Pack, fix smearing to 0.01-0.02 Ry from run inputs
The draft took degauss 0.01 from the input generator; the BO-LPSC1.6
EOS and V0 relax inputs in backup A use 0.02 (electronic-structure SCF
0.01). Monkhorst-Pack added as ref 8; later references renumbered to 19
in the Word file, the md copy and the Docs document. LPSC1.6 and
O-LPSC1.6 K_POINTS/degauss are still to be read from the run inputs.

Co-Authored-By: Claude Opus 5.5 <noreply@anthropic.com>
Claude-Session: https://claude.ai/code/session_01QtbBQvJTvwH5CtkzA6CTzs
</commit_message>
<xml_diff>
--- a/kb/papers/b2o3_bo_lpsc16_methods_2026_10_20.docx
+++ b/kb/papers/b2o3_bo_lpsc16_methods_2026_10_20.docx
@@ -38,13 +38,22 @@
         <w:t xml:space="preserve">[5–7]</w:t>
       </w:r>
       <w:r>
-        <w:t xml:space="preserve"> The Brillouin zone was sampled with Γ-centered Monkhorst–Pack grids, and Marzari–Vanderbilt smearing of 0.01 Ry was applied.</w:t>
+        <w:t xml:space="preserve"> The Brillouin zone was sampled with Γ-centered Monkhorst–Pack grids,</w:t>
       </w:r>
       <w:r>
         <w:rPr>
           <w:vertAlign w:val="superscript"/>
         </w:rPr>
         <w:t xml:space="preserve">[8]</w:t>
+      </w:r>
+      <w:r>
+        <w:t xml:space="preserve"> and Marzari–Vanderbilt smearing of 0.01–0.02 Ry was applied.</w:t>
+      </w:r>
+      <w:r>
+        <w:rPr>
+          <w:vertAlign w:val="superscript"/>
+        </w:rPr>
+        <w:t xml:space="preserve">[9]</w:t>
       </w:r>
       <w:r>
         <w:t xml:space="preserve"> Ionic positions were relaxed until all force components fell below 10</w:t>
@@ -182,7 +191,7 @@
         <w:rPr>
           <w:vertAlign w:val="superscript"/>
         </w:rPr>
-        <w:t xml:space="preserve">[9]</w:t>
+        <w:t xml:space="preserve">[10]</w:t>
       </w:r>
       <w:r>
         <w:t xml:space="preserve"> the 45 distributions of S</w:t>
@@ -586,7 +595,7 @@
         <w:rPr>
           <w:vertAlign w:val="superscript"/>
         </w:rPr>
-        <w:t xml:space="preserve">[10]</w:t>
+        <w:t xml:space="preserve">[11]</w:t>
       </w:r>
       <w:r>
         <w:t xml:space="preserve"> and the ions were finally relaxed at </w:t>
@@ -629,7 +638,7 @@
         <w:rPr>
           <w:vertAlign w:val="superscript"/>
         </w:rPr>
-        <w:t xml:space="preserve">[9,11]</w:t>
+        <w:t xml:space="preserve">[10,12]</w:t>
       </w:r>
       <w:r>
         <w:t xml:space="preserve"> The </w:t>
@@ -1066,7 +1075,7 @@
         <w:rPr>
           <w:vertAlign w:val="superscript"/>
         </w:rPr>
-        <w:t xml:space="preserve">[12,13]</w:t>
+        <w:t xml:space="preserve">[13,14]</w:t>
       </w:r>
       <w:r>
         <w:t xml:space="preserve"> On a grid with ~0.25 Å spacing, the bond valence sum of a Li</w:t>
@@ -1390,7 +1399,7 @@
         <w:rPr>
           <w:vertAlign w:val="superscript"/>
         </w:rPr>
-        <w:t xml:space="preserve">[14]</w:t>
+        <w:t xml:space="preserve">[15]</w:t>
       </w:r>
       <w:r>
         <w:t xml:space="preserve"> and were broadened with a 0.05 eV Gaussian for display. Energies were referenced to the valence band maximum (VBM), which was taken from the Kohn–Sham eigenvalues of a fixed-occupation calculation. The electron localization function (ELF) was calculated from the SCF valence density,</w:t>
@@ -1399,7 +1408,7 @@
         <w:rPr>
           <w:vertAlign w:val="superscript"/>
         </w:rPr>
-        <w:t xml:space="preserve">[15]</w:t>
+        <w:t xml:space="preserve">[16]</w:t>
       </w:r>
       <w:r>
         <w:t xml:space="preserve"> and its value at the bond midpoint was averaged over all bonds of each type (bonds identified within 2.15, 1.9, 2.3, 2.9, and 2.95 Å for B–S, P–O, P–S, Li–S, and Li–Cl, respectively).</w:t>
@@ -1417,7 +1426,7 @@
         <w:rPr>
           <w:vertAlign w:val="superscript"/>
         </w:rPr>
-        <w:t xml:space="preserve">[16]</w:t>
+        <w:t xml:space="preserve">[17]</w:t>
       </w:r>
       <w:r>
         <w:t xml:space="preserve"> was performed with LOBSTER 5.1.1.</w:t>
@@ -1426,7 +1435,7 @@
         <w:rPr>
           <w:vertAlign w:val="superscript"/>
         </w:rPr>
-        <w:t xml:space="preserve">[17,18]</w:t>
+        <w:t xml:space="preserve">[18,19]</w:t>
       </w:r>
       <w:r>
         <w:t xml:space="preserve"> Because LOBSTER requires PAW wavefunctions, the SCF and non-self-consistent (no symmetry, 960 bands) calculations were repeated on the same structure with PAW datasets from PSlibrary,</w:t>
@@ -1820,27 +1829,27 @@
         <w:tab/>
       </w:r>
       <w:r>
-        <w:t xml:space="preserve">N. Marzari, D. Vanderbilt, A. De Vita, M. C. Payne, </w:t>
-      </w:r>
-      <w:r>
-        <w:rPr>
-          <w:i/>
-          <w:iCs/>
-        </w:rPr>
-        <w:t xml:space="preserve">Phys. Rev. Lett.</w:t>
-      </w:r>
-      <w:r>
-        <w:t xml:space="preserve"> 1999, </w:t>
-      </w:r>
-      <w:r>
-        <w:rPr>
-          <w:i/>
-          <w:iCs/>
-        </w:rPr>
-        <w:t xml:space="preserve">82</w:t>
-      </w:r>
-      <w:r>
-        <w:t xml:space="preserve">, 3296–3299.</w:t>
+        <w:t xml:space="preserve">H. J. Monkhorst, J. D. Pack, </w:t>
+      </w:r>
+      <w:r>
+        <w:rPr>
+          <w:i/>
+          <w:iCs/>
+        </w:rPr>
+        <w:t xml:space="preserve">Phys. Rev. B</w:t>
+      </w:r>
+      <w:r>
+        <w:t xml:space="preserve"> 1976, </w:t>
+      </w:r>
+      <w:r>
+        <w:rPr>
+          <w:i/>
+          <w:iCs/>
+        </w:rPr>
+        <w:t xml:space="preserve">13</w:t>
+      </w:r>
+      <w:r>
+        <w:t xml:space="preserve">, 5188–5192.</w:t>
       </w:r>
     </w:p>
     <w:p>
@@ -1858,17 +1867,27 @@
         <w:tab/>
       </w:r>
       <w:r>
-        <w:t xml:space="preserve">B. M. Wood, M. Dzamba, X. Fu, M. Gao, M. Shuaibi, L. Barroso-Luque, K. Abdelmaqsoud, V. Gharakhanyan, J. R. Kitchin, D. S. Levine, K. Michel, A. Sriram, T. Cohen, A. Das, A. Rizvi, S. J. Sahoo, Z. W. Ulissi, C. L. Zitnick, </w:t>
-      </w:r>
-      <w:r>
-        <w:rPr>
-          <w:i/>
-          <w:iCs/>
-        </w:rPr>
-        <w:t xml:space="preserve">arXiv</w:t>
-      </w:r>
-      <w:r>
-        <w:t xml:space="preserve"> 2025, arXiv:2506.23971.</w:t>
+        <w:t xml:space="preserve">N. Marzari, D. Vanderbilt, A. De Vita, M. C. Payne, </w:t>
+      </w:r>
+      <w:r>
+        <w:rPr>
+          <w:i/>
+          <w:iCs/>
+        </w:rPr>
+        <w:t xml:space="preserve">Phys. Rev. Lett.</w:t>
+      </w:r>
+      <w:r>
+        <w:t xml:space="preserve"> 1999, </w:t>
+      </w:r>
+      <w:r>
+        <w:rPr>
+          <w:i/>
+          <w:iCs/>
+        </w:rPr>
+        <w:t xml:space="preserve">82</w:t>
+      </w:r>
+      <w:r>
+        <w:t xml:space="preserve">, 3296–3299.</w:t>
       </w:r>
     </w:p>
     <w:p>
@@ -1886,27 +1905,17 @@
         <w:tab/>
       </w:r>
       <w:r>
-        <w:t xml:space="preserve">F. Birch, </w:t>
-      </w:r>
-      <w:r>
-        <w:rPr>
-          <w:i/>
-          <w:iCs/>
-        </w:rPr>
-        <w:t xml:space="preserve">Phys. Rev.</w:t>
-      </w:r>
-      <w:r>
-        <w:t xml:space="preserve"> 1947, </w:t>
-      </w:r>
-      <w:r>
-        <w:rPr>
-          <w:i/>
-          <w:iCs/>
-        </w:rPr>
-        <w:t xml:space="preserve">71</w:t>
-      </w:r>
-      <w:r>
-        <w:t xml:space="preserve">, 809–824.</w:t>
+        <w:t xml:space="preserve">B. M. Wood, M. Dzamba, X. Fu, M. Gao, M. Shuaibi, L. Barroso-Luque, K. Abdelmaqsoud, V. Gharakhanyan, J. R. Kitchin, D. S. Levine, K. Michel, A. Sriram, T. Cohen, A. Das, A. Rizvi, S. J. Sahoo, Z. W. Ulissi, C. L. Zitnick, </w:t>
+      </w:r>
+      <w:r>
+        <w:rPr>
+          <w:i/>
+          <w:iCs/>
+        </w:rPr>
+        <w:t xml:space="preserve">arXiv</w:t>
+      </w:r>
+      <w:r>
+        <w:t xml:space="preserve"> 2025, arXiv:2506.23971.</w:t>
       </w:r>
     </w:p>
     <w:p>
@@ -1924,27 +1933,27 @@
         <w:tab/>
       </w:r>
       <w:r>
-        <w:t xml:space="preserve">A. H. Larsen, J. J. Mortensen, J. Blomqvist, I. E. Castelli, R. Christensen, M. Dułak, J. Friis, M. N. Groves, B. Hammer, C. Hargus, E. D. Hermes, P. C. Jennings, P. B. Jensen, J. Kermode, J. R. Kitchin, E. L. Kolsbjerg, J. Kubal, K. Kaasbjerg, S. Lysgaard, J. B. Maronsson, T. Maxson, T. Olsen, L. Pastewka, A. Peterson, C. Rostgaard, J. Schiøtz, O. Schütt, M. Strange, K. S. Thygesen, T. Vegge, L. Vilhelmsen, M. Walter, Z. Zeng, K. W. Jacobsen, </w:t>
-      </w:r>
-      <w:r>
-        <w:rPr>
-          <w:i/>
-          <w:iCs/>
-        </w:rPr>
-        <w:t xml:space="preserve">J. Phys.: Condens. Matter</w:t>
-      </w:r>
-      <w:r>
-        <w:t xml:space="preserve"> 2017, </w:t>
-      </w:r>
-      <w:r>
-        <w:rPr>
-          <w:i/>
-          <w:iCs/>
-        </w:rPr>
-        <w:t xml:space="preserve">29</w:t>
-      </w:r>
-      <w:r>
-        <w:t xml:space="preserve">, 273002.</w:t>
+        <w:t xml:space="preserve">F. Birch, </w:t>
+      </w:r>
+      <w:r>
+        <w:rPr>
+          <w:i/>
+          <w:iCs/>
+        </w:rPr>
+        <w:t xml:space="preserve">Phys. Rev.</w:t>
+      </w:r>
+      <w:r>
+        <w:t xml:space="preserve"> 1947, </w:t>
+      </w:r>
+      <w:r>
+        <w:rPr>
+          <w:i/>
+          <w:iCs/>
+        </w:rPr>
+        <w:t xml:space="preserve">71</w:t>
+      </w:r>
+      <w:r>
+        <w:t xml:space="preserve">, 809–824.</w:t>
       </w:r>
     </w:p>
     <w:p>
@@ -1962,27 +1971,27 @@
         <w:tab/>
       </w:r>
       <w:r>
-        <w:t xml:space="preserve">R. P. Rao, S. Adams, </w:t>
-      </w:r>
-      <w:r>
-        <w:rPr>
-          <w:i/>
-          <w:iCs/>
-        </w:rPr>
-        <w:t xml:space="preserve">Phys. Status Solidi A</w:t>
-      </w:r>
-      <w:r>
-        <w:t xml:space="preserve"> 2011, </w:t>
-      </w:r>
-      <w:r>
-        <w:rPr>
-          <w:i/>
-          <w:iCs/>
-        </w:rPr>
-        <w:t xml:space="preserve">208</w:t>
-      </w:r>
-      <w:r>
-        <w:t xml:space="preserve">, 1804–1807.</w:t>
+        <w:t xml:space="preserve">A. H. Larsen, J. J. Mortensen, J. Blomqvist, I. E. Castelli, R. Christensen, M. Dułak, J. Friis, M. N. Groves, B. Hammer, C. Hargus, E. D. Hermes, P. C. Jennings, P. B. Jensen, J. Kermode, J. R. Kitchin, E. L. Kolsbjerg, J. Kubal, K. Kaasbjerg, S. Lysgaard, J. B. Maronsson, T. Maxson, T. Olsen, L. Pastewka, A. Peterson, C. Rostgaard, J. Schiøtz, O. Schütt, M. Strange, K. S. Thygesen, T. Vegge, L. Vilhelmsen, M. Walter, Z. Zeng, K. W. Jacobsen, </w:t>
+      </w:r>
+      <w:r>
+        <w:rPr>
+          <w:i/>
+          <w:iCs/>
+        </w:rPr>
+        <w:t xml:space="preserve">J. Phys.: Condens. Matter</w:t>
+      </w:r>
+      <w:r>
+        <w:t xml:space="preserve"> 2017, </w:t>
+      </w:r>
+      <w:r>
+        <w:rPr>
+          <w:i/>
+          <w:iCs/>
+        </w:rPr>
+        <w:t xml:space="preserve">29</w:t>
+      </w:r>
+      <w:r>
+        <w:t xml:space="preserve">, 273002.</w:t>
       </w:r>
     </w:p>
     <w:p>
@@ -2000,27 +2009,27 @@
         <w:tab/>
       </w:r>
       <w:r>
-        <w:t xml:space="preserve">H. Chen, S. Adams, </w:t>
-      </w:r>
-      <w:r>
-        <w:rPr>
-          <w:i/>
-          <w:iCs/>
-        </w:rPr>
-        <w:t xml:space="preserve">IUCrJ</w:t>
-      </w:r>
-      <w:r>
-        <w:t xml:space="preserve"> 2017, </w:t>
-      </w:r>
-      <w:r>
-        <w:rPr>
-          <w:i/>
-          <w:iCs/>
-        </w:rPr>
-        <w:t xml:space="preserve">4</w:t>
-      </w:r>
-      <w:r>
-        <w:t xml:space="preserve">, 614–625.</w:t>
+        <w:t xml:space="preserve">R. P. Rao, S. Adams, </w:t>
+      </w:r>
+      <w:r>
+        <w:rPr>
+          <w:i/>
+          <w:iCs/>
+        </w:rPr>
+        <w:t xml:space="preserve">Phys. Status Solidi A</w:t>
+      </w:r>
+      <w:r>
+        <w:t xml:space="preserve"> 2011, </w:t>
+      </w:r>
+      <w:r>
+        <w:rPr>
+          <w:i/>
+          <w:iCs/>
+        </w:rPr>
+        <w:t xml:space="preserve">208</w:t>
+      </w:r>
+      <w:r>
+        <w:t xml:space="preserve">, 1804–1807.</w:t>
       </w:r>
     </w:p>
     <w:p>
@@ -2038,27 +2047,27 @@
         <w:tab/>
       </w:r>
       <w:r>
-        <w:t xml:space="preserve">M. Kawamura, Y. Gohda, S. Tsuneyuki, </w:t>
-      </w:r>
-      <w:r>
-        <w:rPr>
-          <w:i/>
-          <w:iCs/>
-        </w:rPr>
-        <w:t xml:space="preserve">Phys. Rev. B</w:t>
-      </w:r>
-      <w:r>
-        <w:t xml:space="preserve"> 2014, </w:t>
-      </w:r>
-      <w:r>
-        <w:rPr>
-          <w:i/>
-          <w:iCs/>
-        </w:rPr>
-        <w:t xml:space="preserve">89</w:t>
-      </w:r>
-      <w:r>
-        <w:t xml:space="preserve">, 094515.</w:t>
+        <w:t xml:space="preserve">H. Chen, S. Adams, </w:t>
+      </w:r>
+      <w:r>
+        <w:rPr>
+          <w:i/>
+          <w:iCs/>
+        </w:rPr>
+        <w:t xml:space="preserve">IUCrJ</w:t>
+      </w:r>
+      <w:r>
+        <w:t xml:space="preserve"> 2017, </w:t>
+      </w:r>
+      <w:r>
+        <w:rPr>
+          <w:i/>
+          <w:iCs/>
+        </w:rPr>
+        <w:t xml:space="preserve">4</w:t>
+      </w:r>
+      <w:r>
+        <w:t xml:space="preserve">, 614–625.</w:t>
       </w:r>
     </w:p>
     <w:p>
@@ -2076,27 +2085,27 @@
         <w:tab/>
       </w:r>
       <w:r>
-        <w:t xml:space="preserve">A. D. Becke, K. E. Edgecombe, </w:t>
-      </w:r>
-      <w:r>
-        <w:rPr>
-          <w:i/>
-          <w:iCs/>
-        </w:rPr>
-        <w:t xml:space="preserve">J. Chem. Phys.</w:t>
-      </w:r>
-      <w:r>
-        <w:t xml:space="preserve"> 1990, </w:t>
-      </w:r>
-      <w:r>
-        <w:rPr>
-          <w:i/>
-          <w:iCs/>
-        </w:rPr>
-        <w:t xml:space="preserve">92</w:t>
-      </w:r>
-      <w:r>
-        <w:t xml:space="preserve">, 5397–5403.</w:t>
+        <w:t xml:space="preserve">M. Kawamura, Y. Gohda, S. Tsuneyuki, </w:t>
+      </w:r>
+      <w:r>
+        <w:rPr>
+          <w:i/>
+          <w:iCs/>
+        </w:rPr>
+        <w:t xml:space="preserve">Phys. Rev. B</w:t>
+      </w:r>
+      <w:r>
+        <w:t xml:space="preserve"> 2014, </w:t>
+      </w:r>
+      <w:r>
+        <w:rPr>
+          <w:i/>
+          <w:iCs/>
+        </w:rPr>
+        <w:t xml:space="preserve">89</w:t>
+      </w:r>
+      <w:r>
+        <w:t xml:space="preserve">, 094515.</w:t>
       </w:r>
     </w:p>
     <w:p>
@@ -2114,27 +2123,27 @@
         <w:tab/>
       </w:r>
       <w:r>
-        <w:t xml:space="preserve">R. Dronskowski, P. E. Blöchl, </w:t>
-      </w:r>
-      <w:r>
-        <w:rPr>
-          <w:i/>
-          <w:iCs/>
-        </w:rPr>
-        <w:t xml:space="preserve">J. Phys. Chem.</w:t>
-      </w:r>
-      <w:r>
-        <w:t xml:space="preserve"> 1993, </w:t>
-      </w:r>
-      <w:r>
-        <w:rPr>
-          <w:i/>
-          <w:iCs/>
-        </w:rPr>
-        <w:t xml:space="preserve">97</w:t>
-      </w:r>
-      <w:r>
-        <w:t xml:space="preserve">, 8617–8624.</w:t>
+        <w:t xml:space="preserve">A. D. Becke, K. E. Edgecombe, </w:t>
+      </w:r>
+      <w:r>
+        <w:rPr>
+          <w:i/>
+          <w:iCs/>
+        </w:rPr>
+        <w:t xml:space="preserve">J. Chem. Phys.</w:t>
+      </w:r>
+      <w:r>
+        <w:t xml:space="preserve"> 1990, </w:t>
+      </w:r>
+      <w:r>
+        <w:rPr>
+          <w:i/>
+          <w:iCs/>
+        </w:rPr>
+        <w:t xml:space="preserve">92</w:t>
+      </w:r>
+      <w:r>
+        <w:t xml:space="preserve">, 5397–5403.</w:t>
       </w:r>
     </w:p>
     <w:p>
@@ -2152,27 +2161,27 @@
         <w:tab/>
       </w:r>
       <w:r>
-        <w:t xml:space="preserve">S. Maintz, V. L. Deringer, A. L. Tchougréeff, R. Dronskowski, </w:t>
-      </w:r>
-      <w:r>
-        <w:rPr>
-          <w:i/>
-          <w:iCs/>
-        </w:rPr>
-        <w:t xml:space="preserve">J. Comput. Chem.</w:t>
-      </w:r>
-      <w:r>
-        <w:t xml:space="preserve"> 2016, </w:t>
-      </w:r>
-      <w:r>
-        <w:rPr>
-          <w:i/>
-          <w:iCs/>
-        </w:rPr>
-        <w:t xml:space="preserve">37</w:t>
-      </w:r>
-      <w:r>
-        <w:t xml:space="preserve">, 1030–1035.</w:t>
+        <w:t xml:space="preserve">R. Dronskowski, P. E. Blöchl, </w:t>
+      </w:r>
+      <w:r>
+        <w:rPr>
+          <w:i/>
+          <w:iCs/>
+        </w:rPr>
+        <w:t xml:space="preserve">J. Phys. Chem.</w:t>
+      </w:r>
+      <w:r>
+        <w:t xml:space="preserve"> 1993, </w:t>
+      </w:r>
+      <w:r>
+        <w:rPr>
+          <w:i/>
+          <w:iCs/>
+        </w:rPr>
+        <w:t xml:space="preserve">97</w:t>
+      </w:r>
+      <w:r>
+        <w:t xml:space="preserve">, 8617–8624.</w:t>
       </w:r>
     </w:p>
     <w:p>
@@ -2185,6 +2194,44 @@
       </w:pPr>
       <w:r>
         <w:t xml:space="preserve">18.</w:t>
+      </w:r>
+      <w:r>
+        <w:tab/>
+      </w:r>
+      <w:r>
+        <w:t xml:space="preserve">S. Maintz, V. L. Deringer, A. L. Tchougréeff, R. Dronskowski, </w:t>
+      </w:r>
+      <w:r>
+        <w:rPr>
+          <w:i/>
+          <w:iCs/>
+        </w:rPr>
+        <w:t xml:space="preserve">J. Comput. Chem.</w:t>
+      </w:r>
+      <w:r>
+        <w:t xml:space="preserve"> 2016, </w:t>
+      </w:r>
+      <w:r>
+        <w:rPr>
+          <w:i/>
+          <w:iCs/>
+        </w:rPr>
+        <w:t xml:space="preserve">37</w:t>
+      </w:r>
+      <w:r>
+        <w:t xml:space="preserve">, 1030–1035.</w:t>
+      </w:r>
+    </w:p>
+    <w:p>
+      <w:pPr>
+        <w:tabs>
+          <w:tab w:val="left" w:pos="480"/>
+        </w:tabs>
+        <w:spacing w:after="0" w:line="480" w:lineRule="auto"/>
+        <w:ind w:left="480" w:hanging="480"/>
+      </w:pPr>
+      <w:r>
+        <w:t xml:space="preserve">19.</w:t>
       </w:r>
       <w:r>
         <w:tab/>

</xml_diff>

<commit_message>
B2O3 Methods sentence 3: per-system k-point grids from run inputs
LPSC1.6 6x6x3 (EOS and V0 inputs in backup B), O-LPSC1.6 2x2x1 (EOS
inputs in backup A; V0 relax by runner record), BO-LPSC1.6 3x3x1.
Smearing 0.01 Ry for all, 0.02 Ry only for the BO-LPSC1.6 structural
relaxations. Still open: smearing type for LPSC1.6 and O-LPSC1.6, and
the separate ONCV protocol of the O-LPSC1.6 ELF run.

Co-Authored-By: Claude Opus 5.5 <noreply@anthropic.com>
Claude-Session: https://claude.ai/code/session_01QtbBQvJTvwH5CtkzA6CTzs
</commit_message>
<xml_diff>
--- a/kb/papers/b2o3_bo_lpsc16_methods_2026_10_20.docx
+++ b/kb/papers/b2o3_bo_lpsc16_methods_2026_10_20.docx
@@ -38,7 +38,17 @@
         <w:t xml:space="preserve">[5–7]</w:t>
       </w:r>
       <w:r>
-        <w:t xml:space="preserve"> The Brillouin zone was sampled with Γ-centered Monkhorst–Pack grids,</w:t>
+        <w:t xml:space="preserve"> The Brillouin zone was sampled with Γ-centered Monkhorst–Pack </w:t>
+      </w:r>
+      <w:r>
+        <w:rPr>
+          <w:i/>
+          <w:iCs/>
+        </w:rPr>
+        <w:t xml:space="preserve">k</w:t>
+      </w:r>
+      <w:r>
+        <w:t xml:space="preserve">-point grids (6 × 6 × 3, 2 × 2 × 1, and 3 × 3 × 1 for LPSC1.6, O-LPSC1.6, and BO-LPSC1.6, respectively),</w:t>
       </w:r>
       <w:r>
         <w:rPr>
@@ -47,7 +57,7 @@
         <w:t xml:space="preserve">[8]</w:t>
       </w:r>
       <w:r>
-        <w:t xml:space="preserve"> and Marzari–Vanderbilt smearing of 0.01–0.02 Ry was applied.</w:t>
+        <w:t xml:space="preserve"> and Marzari–Vanderbilt smearing of 0.01 Ry was applied (0.02 Ry for the structural relaxations of BO-LPSC1.6).</w:t>
       </w:r>
       <w:r>
         <w:rPr>

</xml_diff>

<commit_message>
B2O3 Methods: subscript sample names, BO force threshold 1e-3, wording as in main text
Sample names follow the manuscript (LPSC with subscript 1.6) in the
Word file (real subscript) and in the md and Docs copies (Unicode). The
BO-LPSC1.6 EOS and V0 inputs all use forc_conv_thr 1e-3, so sentence 4
now lists 1e-3 for O-LPSC1.6 and BO-LPSC1.6 and an SCF threshold of
1e-8 Ry or tighter. 'Li+ accessible' and 'Fermi energy' match the text.

Co-Authored-By: Claude Opus 5.5 <noreply@anthropic.com>
Claude-Session: https://claude.ai/code/session_01QtbBQvJTvwH5CtkzA6CTzs
</commit_message>
<xml_diff>
--- a/kb/papers/b2o3_bo_lpsc16_methods_2026_10_20.docx
+++ b/kb/papers/b2o3_bo_lpsc16_methods_2026_10_20.docx
@@ -48,7 +48,34 @@
         <w:t xml:space="preserve">k</w:t>
       </w:r>
       <w:r>
-        <w:t xml:space="preserve">-point grids (6 × 6 × 3, 2 × 2 × 1, and 3 × 3 × 1 for LPSC1.6, O-LPSC1.6, and BO-LPSC1.6, respectively),</w:t>
+        <w:t xml:space="preserve">-point grids (6 × 6 × 3, 2 × 2 × 1, and 3 × 3 × 1 for LPSC</w:t>
+      </w:r>
+      <w:r>
+        <w:rPr>
+          <w:vertAlign w:val="subscript"/>
+        </w:rPr>
+        <w:t xml:space="preserve">1.6</w:t>
+      </w:r>
+      <w:r>
+        <w:t xml:space="preserve">, O-LPSC</w:t>
+      </w:r>
+      <w:r>
+        <w:rPr>
+          <w:vertAlign w:val="subscript"/>
+        </w:rPr>
+        <w:t xml:space="preserve">1.6</w:t>
+      </w:r>
+      <w:r>
+        <w:t xml:space="preserve">, and BO-LPSC</w:t>
+      </w:r>
+      <w:r>
+        <w:rPr>
+          <w:vertAlign w:val="subscript"/>
+        </w:rPr>
+        <w:t xml:space="preserve">1.6</w:t>
+      </w:r>
+      <w:r>
+        <w:t xml:space="preserve">, respectively),</w:t>
       </w:r>
       <w:r>
         <w:rPr>
@@ -57,7 +84,16 @@
         <w:t xml:space="preserve">[8]</w:t>
       </w:r>
       <w:r>
-        <w:t xml:space="preserve"> and Marzari–Vanderbilt smearing of 0.01 Ry was applied (0.02 Ry for the structural relaxations of BO-LPSC1.6).</w:t>
+        <w:t xml:space="preserve"> and Marzari–Vanderbilt smearing of 0.01 Ry was applied (0.02 Ry for the structural relaxations of BO-LPSC</w:t>
+      </w:r>
+      <w:r>
+        <w:rPr>
+          <w:vertAlign w:val="subscript"/>
+        </w:rPr>
+        <w:t xml:space="preserve">1.6</w:t>
+      </w:r>
+      <w:r>
+        <w:t xml:space="preserve">).</w:t>
       </w:r>
       <w:r>
         <w:rPr>
@@ -102,7 +138,25 @@
         <w:t xml:space="preserve">−1</w:t>
       </w:r>
       <w:r>
-        <w:t xml:space="preserve"> for O-LPSC1.6), with a self-consistent field (SCF) convergence threshold of 10</w:t>
+        <w:t xml:space="preserve"> for O-LPSC</w:t>
+      </w:r>
+      <w:r>
+        <w:rPr>
+          <w:vertAlign w:val="subscript"/>
+        </w:rPr>
+        <w:t xml:space="preserve">1.6</w:t>
+      </w:r>
+      <w:r>
+        <w:t xml:space="preserve"> and BO-LPSC</w:t>
+      </w:r>
+      <w:r>
+        <w:rPr>
+          <w:vertAlign w:val="subscript"/>
+        </w:rPr>
+        <w:t xml:space="preserve">1.6</w:t>
+      </w:r>
+      <w:r>
+        <w:t xml:space="preserve">), with a self-consistent field (SCF) convergence threshold of 10</w:t>
       </w:r>
       <w:r>
         <w:rPr>
@@ -111,7 +165,7 @@
         <w:t xml:space="preserve">−8</w:t>
       </w:r>
       <w:r>
-        <w:t xml:space="preserve"> Ry.</w:t>
+        <w:t xml:space="preserve"> Ry or tighter.</w:t>
       </w:r>
     </w:p>
     <w:p>
@@ -120,7 +174,16 @@
         <w:ind w:firstLineChars="150" w:firstLine="360"/>
       </w:pPr>
       <w:r>
-        <w:t xml:space="preserve">Three structural models were constructed. LPSC1.6 was represented by a 62-atom supercell (Li</w:t>
+        <w:t xml:space="preserve">Three structural models were constructed. LPSC</w:t>
+      </w:r>
+      <w:r>
+        <w:rPr>
+          <w:vertAlign w:val="subscript"/>
+        </w:rPr>
+        <w:t xml:space="preserve">1.6</w:t>
+      </w:r>
+      <w:r>
+        <w:t xml:space="preserve"> was represented by a 62-atom supercell (Li</w:t>
       </w:r>
       <w:r>
         <w:rPr>
@@ -231,7 +294,16 @@
         <w:t xml:space="preserve">+</w:t>
       </w:r>
       <w:r>
-        <w:t xml:space="preserve"> arrangements were sampled for the lowest-energy anion distributions, and the lowest-energy configuration was annealed by UMA-based molecular dynamics (MD) at 500 K for 50 ps. O-LPSC1.6 (Li</w:t>
+        <w:t xml:space="preserve"> arrangements were sampled for the lowest-energy anion distributions, and the lowest-energy configuration was annealed by UMA-based molecular dynamics (MD) at 500 K for 50 ps. O-LPSC</w:t>
+      </w:r>
+      <w:r>
+        <w:rPr>
+          <w:vertAlign w:val="subscript"/>
+        </w:rPr>
+        <w:t xml:space="preserve">1.6</w:t>
+      </w:r>
+      <w:r>
+        <w:t xml:space="preserve"> (Li</w:t>
       </w:r>
       <w:r>
         <w:rPr>
@@ -339,7 +411,16 @@
         <w:t xml:space="preserve">4</w:t>
       </w:r>
       <w:r>
-        <w:t xml:space="preserve"> corners). BO-LPSC1.6 (Li</w:t>
+        <w:t xml:space="preserve"> corners). BO-LPSC</w:t>
+      </w:r>
+      <w:r>
+        <w:rPr>
+          <w:vertAlign w:val="subscript"/>
+        </w:rPr>
+        <w:t xml:space="preserve">1.6</w:t>
+      </w:r>
+      <w:r>
+        <w:t xml:space="preserve"> (Li</w:t>
       </w:r>
       <w:r>
         <w:rPr>
@@ -447,7 +528,16 @@
         <w:t xml:space="preserve">1.6</w:t>
       </w:r>
       <w:r>
-        <w:t xml:space="preserve">; 128 atoms) was built by doubling the LPSC1.6 cell along </w:t>
+        <w:t xml:space="preserve">; 128 atoms) was built by doubling the LPSC</w:t>
+      </w:r>
+      <w:r>
+        <w:rPr>
+          <w:vertAlign w:val="subscript"/>
+        </w:rPr>
+        <w:t xml:space="preserve">1.6</w:t>
+      </w:r>
+      <w:r>
+        <w:t xml:space="preserve"> cell along </w:t>
       </w:r>
       <w:r>
         <w:rPr>
@@ -567,7 +657,34 @@
         <w:ind w:firstLineChars="150" w:firstLine="360"/>
       </w:pPr>
       <w:r>
-        <w:t xml:space="preserve">For each model, the UMA-optimized cell was isotropically scaled to 0.96–1.06 (LPSC1.6, 11 volumes), 0.94–1.06 (O-LPSC1.6, 7 volumes), or 0.96–1.04 (BO-LPSC1.6, 5 volumes) of its volume, and the ionic positions were relaxed by DFT at each fixed cell. The energy–volume data were fitted to the third-order Birch–Murnaghan equation of state to obtain the equilibrium volume (</w:t>
+        <w:t xml:space="preserve">For each model, the UMA-optimized cell was isotropically scaled to 0.96–1.06 (LPSC</w:t>
+      </w:r>
+      <w:r>
+        <w:rPr>
+          <w:vertAlign w:val="subscript"/>
+        </w:rPr>
+        <w:t xml:space="preserve">1.6</w:t>
+      </w:r>
+      <w:r>
+        <w:t xml:space="preserve">, 11 volumes), 0.94–1.06 (O-LPSC</w:t>
+      </w:r>
+      <w:r>
+        <w:rPr>
+          <w:vertAlign w:val="subscript"/>
+        </w:rPr>
+        <w:t xml:space="preserve">1.6</w:t>
+      </w:r>
+      <w:r>
+        <w:t xml:space="preserve">, 7 volumes), or 0.96–1.04 (BO-LPSC</w:t>
+      </w:r>
+      <w:r>
+        <w:rPr>
+          <w:vertAlign w:val="subscript"/>
+        </w:rPr>
+        <w:t xml:space="preserve">1.6</w:t>
+      </w:r>
+      <w:r>
+        <w:t xml:space="preserve">, 5 volumes) of its volume, and the ionic positions were relaxed by DFT at each fixed cell. The energy–volume data were fitted to the third-order Birch–Murnaghan equation of state to obtain the equilibrium volume (</w:t>
       </w:r>
       <w:r>
         <w:rPr>
@@ -667,7 +784,34 @@
         <w:t xml:space="preserve">0</w:t>
       </w:r>
       <w:r>
-        <w:t xml:space="preserve"> cells (62, 62, and 128 atoms for LPSC1.6, O-LPSC1.6, and BO-LPSC1.6, respectively) were simulated in the </w:t>
+        <w:t xml:space="preserve"> cells (62, 62, and 128 atoms for LPSC</w:t>
+      </w:r>
+      <w:r>
+        <w:rPr>
+          <w:vertAlign w:val="subscript"/>
+        </w:rPr>
+        <w:t xml:space="preserve">1.6</w:t>
+      </w:r>
+      <w:r>
+        <w:t xml:space="preserve">, O-LPSC</w:t>
+      </w:r>
+      <w:r>
+        <w:rPr>
+          <w:vertAlign w:val="subscript"/>
+        </w:rPr>
+        <w:t xml:space="preserve">1.6</w:t>
+      </w:r>
+      <w:r>
+        <w:t xml:space="preserve">, and BO-LPSC</w:t>
+      </w:r>
+      <w:r>
+        <w:rPr>
+          <w:vertAlign w:val="subscript"/>
+        </w:rPr>
+        <w:t xml:space="preserve">1.6</w:t>
+      </w:r>
+      <w:r>
+        <w:t xml:space="preserve">, respectively) were simulated in the </w:t>
       </w:r>
       <w:r>
         <w:rPr>
@@ -677,7 +821,34 @@
         <w:t xml:space="preserve">NVT</w:t>
       </w:r>
       <w:r>
-        <w:t xml:space="preserve"> ensemble with a Langevin thermostat (time step 2 fs, friction 0.02 in ASE units) at 600, 800, and 1000 K, with 5 ps of equilibration followed by 200 ps of production. At each temperature, three (LPSC1.6 and BO-LPSC1.6) or four (O-LPSC1.6) independent runs with different random seeds were performed. The Li</w:t>
+        <w:t xml:space="preserve"> ensemble with a Langevin thermostat (time step 2 fs, friction 0.02 in ASE units) at 600, 800, and 1000 K, with 5 ps of equilibration followed by 200 ps of production. At each temperature, three (LPSC</w:t>
+      </w:r>
+      <w:r>
+        <w:rPr>
+          <w:vertAlign w:val="subscript"/>
+        </w:rPr>
+        <w:t xml:space="preserve">1.6</w:t>
+      </w:r>
+      <w:r>
+        <w:t xml:space="preserve"> and BO-LPSC</w:t>
+      </w:r>
+      <w:r>
+        <w:rPr>
+          <w:vertAlign w:val="subscript"/>
+        </w:rPr>
+        <w:t xml:space="preserve">1.6</w:t>
+      </w:r>
+      <w:r>
+        <w:t xml:space="preserve">) or four (O-LPSC</w:t>
+      </w:r>
+      <w:r>
+        <w:rPr>
+          <w:vertAlign w:val="subscript"/>
+        </w:rPr>
+        <w:t xml:space="preserve">1.6</w:t>
+      </w:r>
+      <w:r>
+        <w:t xml:space="preserve">) independent runs with different random seeds were performed. The Li</w:t>
       </w:r>
       <w:r>
         <w:rPr>
@@ -1151,7 +1322,7 @@
         <w:t xml:space="preserve">+</w:t>
       </w:r>
       <w:r>
-        <w:t xml:space="preserve">-accessible volume fraction was defined as the fraction of grid points within 0.5 (valence units)</w:t>
+        <w:t xml:space="preserve"> accessible volume fraction was defined as the fraction of grid points within 0.5 (valence units)</w:t>
       </w:r>
       <w:r>
         <w:rPr>
@@ -1403,7 +1574,16 @@
         <w:ind w:firstLineChars="150" w:firstLine="360"/>
       </w:pPr>
       <w:r>
-        <w:t xml:space="preserve">The density of states (DOS) and projected DOS (PDOS) of BO-LPSC1.6 were calculated non-self-consistently with the optimized tetrahedron method and projections onto atomic orbitals,</w:t>
+        <w:t xml:space="preserve">The density of states (DOS) and projected DOS (PDOS) of BO-LPSC</w:t>
+      </w:r>
+      <w:r>
+        <w:rPr>
+          <w:vertAlign w:val="subscript"/>
+        </w:rPr>
+        <w:t xml:space="preserve">1.6</w:t>
+      </w:r>
+      <w:r>
+        <w:t xml:space="preserve"> were calculated non-self-consistently with the optimized tetrahedron method and projections onto atomic orbitals,</w:t>
       </w:r>
       <w:r>
         <w:rPr>
@@ -1527,7 +1707,7 @@
         <w:t xml:space="preserve">p</w:t>
       </w:r>
       <w:r>
-        <w:t xml:space="preserve">), with a charge spilling of 1.19%. Integrated COHP (ICOHP) values up to the Fermi level were averaged over each bond type. Bond lengths were averaged over first-shell pairs in the </w:t>
+        <w:t xml:space="preserve">), with a charge spilling of 1.19%. Integrated COHP (ICOHP) values up to the Fermi energy were averaged over each bond type. Bond lengths were averaged over first-shell pairs in the </w:t>
       </w:r>
       <w:r>
         <w:rPr>

</xml_diff>

<commit_message>
B2O3 Methods sentence 4: state 10^-3 Ry/bohr as the main force threshold, LPSC1.6 in parentheses
Two of the three models used 1e-3, so the sentence now gives that value
and names LPSC1.6 (1e-4) as the exception, matching the default-plus-
exception form of the smearing in sentence 3. Docs, Word and md updated.

Co-Authored-By: Claude Opus 5.5 <noreply@anthropic.com>
Claude-Session: https://claude.ai/code/session_01QtbBQvJTvwH5CtkzA6CTzs
</commit_message>
<xml_diff>
--- a/kb/papers/b2o3_bo_lpsc16_methods_2026_10_20.docx
+++ b/kb/papers/b2o3_bo_lpsc16_methods_2026_10_20.docx
@@ -108,6 +108,24 @@
         <w:rPr>
           <w:vertAlign w:val="superscript"/>
         </w:rPr>
+        <w:t xml:space="preserve">−3</w:t>
+      </w:r>
+      <w:r>
+        <w:t xml:space="preserve"> Ry bohr</w:t>
+      </w:r>
+      <w:r>
+        <w:rPr>
+          <w:vertAlign w:val="superscript"/>
+        </w:rPr>
+        <w:t xml:space="preserve">−1</w:t>
+      </w:r>
+      <w:r>
+        <w:t xml:space="preserve"> (10</w:t>
+      </w:r>
+      <w:r>
+        <w:rPr>
+          <w:vertAlign w:val="superscript"/>
+        </w:rPr>
         <w:t xml:space="preserve">−4</w:t>
       </w:r>
       <w:r>
@@ -120,34 +138,7 @@
         <w:t xml:space="preserve">−1</w:t>
       </w:r>
       <w:r>
-        <w:t xml:space="preserve"> (10</w:t>
-      </w:r>
-      <w:r>
-        <w:rPr>
-          <w:vertAlign w:val="superscript"/>
-        </w:rPr>
-        <w:t xml:space="preserve">−3</w:t>
-      </w:r>
-      <w:r>
-        <w:t xml:space="preserve"> Ry bohr</w:t>
-      </w:r>
-      <w:r>
-        <w:rPr>
-          <w:vertAlign w:val="superscript"/>
-        </w:rPr>
-        <w:t xml:space="preserve">−1</w:t>
-      </w:r>
-      <w:r>
-        <w:t xml:space="preserve"> for O-LPSC</w:t>
-      </w:r>
-      <w:r>
-        <w:rPr>
-          <w:vertAlign w:val="subscript"/>
-        </w:rPr>
-        <w:t xml:space="preserve">1.6</w:t>
-      </w:r>
-      <w:r>
-        <w:t xml:space="preserve"> and BO-LPSC</w:t>
+        <w:t xml:space="preserve"> for LPSC</w:t>
       </w:r>
       <w:r>
         <w:rPr>

</xml_diff>

<commit_message>
B2O3 Methods sentence 7: split at the colon into two sentences
'...interatomic potential:[10] the 45 distributions' read awkwardly, so
the UMA introduction now ends with its citation and the screening steps
start a new sentence. Docs, Word and md updated; open_items points the
sentence-by-sentence reading at the O-LPSC1.6 model sentence.

Co-Authored-By: Claude Opus 5.5 <noreply@anthropic.com>
Claude-Session: https://claude.ai/code/session_01QtbBQvJTvwH5CtkzA6CTzs
</commit_message>
<xml_diff>
--- a/kb/papers/b2o3_bo_lpsc16_methods_2026_10_20.docx
+++ b/kb/papers/b2o3_bo_lpsc16_methods_2026_10_20.docx
@@ -249,7 +249,7 @@
         <w:t xml:space="preserve">+</w:t>
       </w:r>
       <w:r>
-        <w:t xml:space="preserve"> disorder was sampled with the Universal Model for Atoms (UMA) machine-learning interatomic potential:</w:t>
+        <w:t xml:space="preserve"> disorder was sampled with the Universal Model for Atoms (UMA) machine-learning interatomic potential.</w:t>
       </w:r>
       <w:r>
         <w:rPr>
@@ -258,7 +258,7 @@
         <w:t xml:space="preserve">[10]</w:t>
       </w:r>
       <w:r>
-        <w:t xml:space="preserve"> the 45 distributions of S</w:t>
+        <w:t xml:space="preserve"> The 45 distributions of S</w:t>
       </w:r>
       <w:r>
         <w:rPr>

</xml_diff>

<commit_message>
B2O3 Methods paragraph 2: one pattern for the three models, shorter BO sentence
Each model now reads 'NAME (cell formula, i.e., per-formula-unit
composition) was obtained by ...' plus how it was chosen. The BO-LPSC1.6
sentence is shortened and states that the O site was confirmed by DFT,
since the lowest UMA configuration (O on B) was overturned by a 64-atom
DFT test. The closing sentence now covers both doped models. Docs, Word
and md updated.

Co-Authored-By: Claude Opus 5.5 <noreply@anthropic.com>
Claude-Session: https://claude.ai/code/session_01QtbBQvJTvwH5CtkzA6CTzs
</commit_message>
<xml_diff>
--- a/kb/papers/b2o3_bo_lpsc16_methods_2026_10_20.docx
+++ b/kb/papers/b2o3_bo_lpsc16_methods_2026_10_20.docx
@@ -174,7 +174,7 @@
         <w:t xml:space="preserve">1.6</w:t>
       </w:r>
       <w:r>
-        <w:t xml:space="preserve"> was represented by a 62-atom supercell (Li</w:t>
+        <w:t xml:space="preserve"> (Li</w:t>
       </w:r>
       <w:r>
         <w:rPr>
@@ -210,7 +210,34 @@
         <w:t xml:space="preserve">8</w:t>
       </w:r>
       <w:r>
-        <w:t xml:space="preserve">, five formula units) obtained by stacking the primitive argyrodite cell (</w:t>
+        <w:t xml:space="preserve">, i.e., Li</w:t>
+      </w:r>
+      <w:r>
+        <w:rPr>
+          <w:vertAlign w:val="subscript"/>
+        </w:rPr>
+        <w:t xml:space="preserve">5.4</w:t>
+      </w:r>
+      <w:r>
+        <w:t xml:space="preserve">PS</w:t>
+      </w:r>
+      <w:r>
+        <w:rPr>
+          <w:vertAlign w:val="subscript"/>
+        </w:rPr>
+        <w:t xml:space="preserve">4.4</w:t>
+      </w:r>
+      <w:r>
+        <w:t xml:space="preserve">Cl</w:t>
+      </w:r>
+      <w:r>
+        <w:rPr>
+          <w:vertAlign w:val="subscript"/>
+        </w:rPr>
+        <w:t xml:space="preserve">1.6</w:t>
+      </w:r>
+      <w:r>
+        <w:t xml:space="preserve">) was obtained by stacking five primitive argyrodite cells (</w:t>
       </w:r>
       <w:r>
         <w:rPr>
@@ -230,7 +257,7 @@
         <w:t xml:space="preserve">α</w:t>
       </w:r>
       <w:r>
-        <w:t xml:space="preserve"> = 60°) five times along the </w:t>
+        <w:t xml:space="preserve"> = 60°) along the </w:t>
       </w:r>
       <w:r>
         <w:rPr>
@@ -375,6 +402,15 @@
         <w:t xml:space="preserve">2−</w:t>
       </w:r>
       <w:r>
+        <w:t xml:space="preserve"> in LPSC</w:t>
+      </w:r>
+      <w:r>
+        <w:rPr>
+          <w:vertAlign w:val="subscript"/>
+        </w:rPr>
+        <w:t xml:space="preserve">1.6</w:t>
+      </w:r>
+      <w:r>
         <w:t xml:space="preserve"> with O</w:t>
       </w:r>
       <w:r>
@@ -519,7 +555,70 @@
         <w:t xml:space="preserve">1.6</w:t>
       </w:r>
       <w:r>
-        <w:t xml:space="preserve">; 128 atoms) was built by doubling the LPSC</w:t>
+        <w:t xml:space="preserve">) was obtained by placing one B</w:t>
+      </w:r>
+      <w:r>
+        <w:rPr>
+          <w:vertAlign w:val="subscript"/>
+        </w:rPr>
+        <w:t xml:space="preserve">2</w:t>
+      </w:r>
+      <w:r>
+        <w:t xml:space="preserve">O</w:t>
+      </w:r>
+      <w:r>
+        <w:rPr>
+          <w:vertAlign w:val="subscript"/>
+        </w:rPr>
+        <w:t xml:space="preserve">3</w:t>
+      </w:r>
+      <w:r>
+        <w:t xml:space="preserve"> unit (two B</w:t>
+      </w:r>
+      <w:r>
+        <w:rPr>
+          <w:vertAlign w:val="superscript"/>
+        </w:rPr>
+        <w:t xml:space="preserve">3+</w:t>
+      </w:r>
+      <w:r>
+        <w:t xml:space="preserve"> on P</w:t>
+      </w:r>
+      <w:r>
+        <w:rPr>
+          <w:vertAlign w:val="superscript"/>
+        </w:rPr>
+        <w:t xml:space="preserve">5+</w:t>
+      </w:r>
+      <w:r>
+        <w:t xml:space="preserve"> sites, three O</w:t>
+      </w:r>
+      <w:r>
+        <w:rPr>
+          <w:vertAlign w:val="superscript"/>
+        </w:rPr>
+        <w:t xml:space="preserve">2−</w:t>
+      </w:r>
+      <w:r>
+        <w:t xml:space="preserve"> on S</w:t>
+      </w:r>
+      <w:r>
+        <w:rPr>
+          <w:vertAlign w:val="superscript"/>
+        </w:rPr>
+        <w:t xml:space="preserve">2−</w:t>
+      </w:r>
+      <w:r>
+        <w:t xml:space="preserve"> sites, and four added Li</w:t>
+      </w:r>
+      <w:r>
+        <w:rPr>
+          <w:vertAlign w:val="superscript"/>
+        </w:rPr>
+        <w:t xml:space="preserve">+</w:t>
+      </w:r>
+      <w:r>
+        <w:t xml:space="preserve"> for charge balance) in a 1 × 1 × 2 LPSC</w:t>
       </w:r>
       <w:r>
         <w:rPr>
@@ -528,118 +627,7 @@
         <w:t xml:space="preserve">1.6</w:t>
       </w:r>
       <w:r>
-        <w:t xml:space="preserve"> cell along </w:t>
-      </w:r>
-      <w:r>
-        <w:rPr>
-          <w:i/>
-          <w:iCs/>
-        </w:rPr>
-        <w:t xml:space="preserve">c</w:t>
-      </w:r>
-      <w:r>
-        <w:t xml:space="preserve"> and introducing one B</w:t>
-      </w:r>
-      <w:r>
-        <w:rPr>
-          <w:vertAlign w:val="subscript"/>
-        </w:rPr>
-        <w:t xml:space="preserve">2</w:t>
-      </w:r>
-      <w:r>
-        <w:t xml:space="preserve">O</w:t>
-      </w:r>
-      <w:r>
-        <w:rPr>
-          <w:vertAlign w:val="subscript"/>
-        </w:rPr>
-        <w:t xml:space="preserve">3</w:t>
-      </w:r>
-      <w:r>
-        <w:t xml:space="preserve"> unit, with two B</w:t>
-      </w:r>
-      <w:r>
-        <w:rPr>
-          <w:vertAlign w:val="superscript"/>
-        </w:rPr>
-        <w:t xml:space="preserve">3+</w:t>
-      </w:r>
-      <w:r>
-        <w:t xml:space="preserve"> on P</w:t>
-      </w:r>
-      <w:r>
-        <w:rPr>
-          <w:vertAlign w:val="superscript"/>
-        </w:rPr>
-        <w:t xml:space="preserve">5+</w:t>
-      </w:r>
-      <w:r>
-        <w:t xml:space="preserve"> (4b) sites, three O</w:t>
-      </w:r>
-      <w:r>
-        <w:rPr>
-          <w:vertAlign w:val="superscript"/>
-        </w:rPr>
-        <w:t xml:space="preserve">2−</w:t>
-      </w:r>
-      <w:r>
-        <w:t xml:space="preserve"> on S</w:t>
-      </w:r>
-      <w:r>
-        <w:rPr>
-          <w:vertAlign w:val="superscript"/>
-        </w:rPr>
-        <w:t xml:space="preserve">2−</w:t>
-      </w:r>
-      <w:r>
-        <w:t xml:space="preserve"> sites, and four additional Li</w:t>
-      </w:r>
-      <w:r>
-        <w:rPr>
-          <w:vertAlign w:val="superscript"/>
-        </w:rPr>
-        <w:t xml:space="preserve">+</w:t>
-      </w:r>
-      <w:r>
-        <w:t xml:space="preserve"> for charge compensation; its dopant configurations were pre-screened by Ewald electrostatic energy and relaxed with UMA. Because one B</w:t>
-      </w:r>
-      <w:r>
-        <w:rPr>
-          <w:vertAlign w:val="subscript"/>
-        </w:rPr>
-        <w:t xml:space="preserve">2</w:t>
-      </w:r>
-      <w:r>
-        <w:t xml:space="preserve">O</w:t>
-      </w:r>
-      <w:r>
-        <w:rPr>
-          <w:vertAlign w:val="subscript"/>
-        </w:rPr>
-        <w:t xml:space="preserve">3</w:t>
-      </w:r>
-      <w:r>
-        <w:t xml:space="preserve"> unit is the smallest substitution this cell can accommodate, the model corresponds to </w:t>
-      </w:r>
-      <w:r>
-        <w:rPr>
-          <w:i/>
-          <w:iCs/>
-        </w:rPr>
-        <w:t xml:space="preserve">x</w:t>
-      </w:r>
-      <w:r>
-        <w:t xml:space="preserve"> = 0.2, which is higher than the experimental </w:t>
-      </w:r>
-      <w:r>
-        <w:rPr>
-          <w:i/>
-          <w:iCs/>
-        </w:rPr>
-        <w:t xml:space="preserve">x</w:t>
-      </w:r>
-      <w:r>
-        <w:t xml:space="preserve"> = 0.03.</w:t>
+        <w:t xml:space="preserve"> supercell; the configuration was selected by Ewald pre-screening and UMA relaxation, with the O site confirmed by DFT. Both doped models thus contain the smallest dopant amount each cell allows, more than the experimental samples (0.2 vs 0.045 O and 0.2 vs 0.03 B per formula unit).</w:t>
       </w:r>
     </w:p>
     <w:p>

</xml_diff>

<commit_message>
B2O3 Methods paragraph 4: remove overlap with paragraph 2 in the MD sentences
The UMA model name (UMA-s-1p1, OMat task) now appears where UMA is first
introduced; the MD sentence reads 'simulated by UMA-based MD in ASE' and
no longer repeats [10], and 'were simulated' becomes 'were run'. The
Langevin friction of 0.02 ASE units (about 2 ps^-1) was checked in the
MD driver. Docs, Word and md updated.

Co-Authored-By: Claude Opus 5.5 <noreply@anthropic.com>
Claude-Session: https://claude.ai/code/session_01QtbBQvJTvwH5CtkzA6CTzs
</commit_message>
<xml_diff>
--- a/kb/papers/b2o3_bo_lpsc16_methods_2026_10_20.docx
+++ b/kb/papers/b2o3_bo_lpsc16_methods_2026_10_20.docx
@@ -276,7 +276,7 @@
         <w:t xml:space="preserve">+</w:t>
       </w:r>
       <w:r>
-        <w:t xml:space="preserve"> disorder was sampled with the Universal Model for Atoms (UMA) machine-learning interatomic potential.</w:t>
+        <w:t xml:space="preserve"> disorder was sampled with the Universal Model for Atoms (UMA) machine-learning interatomic potential (UMA-s-1p1, OMat task).</w:t>
       </w:r>
       <w:r>
         <w:rPr>
@@ -738,13 +738,13 @@
         <w:t xml:space="preserve">+</w:t>
       </w:r>
       <w:r>
-        <w:t xml:space="preserve"> transport was simulated by MD with the UMA-s-1p1 model (OMat task) in the Atomic Simulation Environment (ASE).</w:t>
-      </w:r>
-      <w:r>
-        <w:rPr>
-          <w:vertAlign w:val="superscript"/>
-        </w:rPr>
-        <w:t xml:space="preserve">[10,12]</w:t>
+        <w:t xml:space="preserve"> transport was simulated by UMA-based MD in the Atomic Simulation Environment (ASE).</w:t>
+      </w:r>
+      <w:r>
+        <w:rPr>
+          <w:vertAlign w:val="superscript"/>
+        </w:rPr>
+        <w:t xml:space="preserve">[12]</w:t>
       </w:r>
       <w:r>
         <w:t xml:space="preserve"> The </w:t>
@@ -790,7 +790,7 @@
         <w:t xml:space="preserve">1.6</w:t>
       </w:r>
       <w:r>
-        <w:t xml:space="preserve">, respectively) were simulated in the </w:t>
+        <w:t xml:space="preserve">, respectively) were run in the </w:t>
       </w:r>
       <w:r>
         <w:rPr>

</xml_diff>

<commit_message>
B2O3 Methods paragraph 4: drop the repeated V0-cell parenthesis and merge the MD sentences
The overlap the user meant was 'The V0 cells (62, 62, and 128 atoms for
..., respectively)': V0 is already stated in paragraph 3 and the atom
counts follow from the paragraph 2 formulas. The MD sentence now reads
'simulated by UMA-based MD in ASE[12] in the NVT ensemble ...'. Docs,
Word and md updated.

Co-Authored-By: Claude Opus 5.5 <noreply@anthropic.com>
Claude-Session: https://claude.ai/code/session_01QtbBQvJTvwH5CtkzA6CTzs
</commit_message>
<xml_diff>
--- a/kb/papers/b2o3_bo_lpsc16_methods_2026_10_20.docx
+++ b/kb/papers/b2o3_bo_lpsc16_methods_2026_10_20.docx
@@ -738,7 +738,7 @@
         <w:t xml:space="preserve">+</w:t>
       </w:r>
       <w:r>
-        <w:t xml:space="preserve"> transport was simulated by UMA-based MD in the Atomic Simulation Environment (ASE).</w:t>
+        <w:t xml:space="preserve"> transport was simulated by UMA-based MD in the Atomic Simulation Environment (ASE)</w:t>
       </w:r>
       <w:r>
         <w:rPr>
@@ -747,50 +747,7 @@
         <w:t xml:space="preserve">[12]</w:t>
       </w:r>
       <w:r>
-        <w:t xml:space="preserve"> The </w:t>
-      </w:r>
-      <w:r>
-        <w:rPr>
-          <w:i/>
-          <w:iCs/>
-        </w:rPr>
-        <w:t xml:space="preserve">V</w:t>
-      </w:r>
-      <w:r>
-        <w:rPr>
-          <w:vertAlign w:val="subscript"/>
-        </w:rPr>
-        <w:t xml:space="preserve">0</w:t>
-      </w:r>
-      <w:r>
-        <w:t xml:space="preserve"> cells (62, 62, and 128 atoms for LPSC</w:t>
-      </w:r>
-      <w:r>
-        <w:rPr>
-          <w:vertAlign w:val="subscript"/>
-        </w:rPr>
-        <w:t xml:space="preserve">1.6</w:t>
-      </w:r>
-      <w:r>
-        <w:t xml:space="preserve">, O-LPSC</w:t>
-      </w:r>
-      <w:r>
-        <w:rPr>
-          <w:vertAlign w:val="subscript"/>
-        </w:rPr>
-        <w:t xml:space="preserve">1.6</w:t>
-      </w:r>
-      <w:r>
-        <w:t xml:space="preserve">, and BO-LPSC</w:t>
-      </w:r>
-      <w:r>
-        <w:rPr>
-          <w:vertAlign w:val="subscript"/>
-        </w:rPr>
-        <w:t xml:space="preserve">1.6</w:t>
-      </w:r>
-      <w:r>
-        <w:t xml:space="preserve">, respectively) were run in the </w:t>
+        <w:t xml:space="preserve"> in the </w:t>
       </w:r>
       <w:r>
         <w:rPr>

</xml_diff>

<commit_message>
B2O3 Methods: seed sentence unified to 'at least three' runs per model and temperature
The user found the per-model list (three for LPSC1.6 and BO-LPSC1.6, four
for O-LPSC1.6) uneven. Records show 3 seeds at 600/800/1000 K for LPSC1.6
and BO-LPSC1.6 and 4 at all three for O-LPSC1.6, so 'at least three' holds
for every model and temperature. The sentence stays because the reported
Ea values are fitted to seed-averaged D. Docs, docx, md and the open_items
pointer updated together.

Co-Authored-By: Claude Opus 5.5 <noreply@anthropic.com>
Claude-Session: https://claude.ai/code/session_01QtbBQvJTvwH5CtkzA6CTzs
</commit_message>
<xml_diff>
--- a/kb/papers/b2o3_bo_lpsc16_methods_2026_10_20.docx
+++ b/kb/papers/b2o3_bo_lpsc16_methods_2026_10_20.docx
@@ -757,34 +757,7 @@
         <w:t xml:space="preserve">NVT</w:t>
       </w:r>
       <w:r>
-        <w:t xml:space="preserve"> ensemble with a Langevin thermostat (time step 2 fs, friction 0.02 in ASE units) at 600, 800, and 1000 K, with 5 ps of equilibration followed by 200 ps of production. At each temperature, three (LPSC</w:t>
-      </w:r>
-      <w:r>
-        <w:rPr>
-          <w:vertAlign w:val="subscript"/>
-        </w:rPr>
-        <w:t xml:space="preserve">1.6</w:t>
-      </w:r>
-      <w:r>
-        <w:t xml:space="preserve"> and BO-LPSC</w:t>
-      </w:r>
-      <w:r>
-        <w:rPr>
-          <w:vertAlign w:val="subscript"/>
-        </w:rPr>
-        <w:t xml:space="preserve">1.6</w:t>
-      </w:r>
-      <w:r>
-        <w:t xml:space="preserve">) or four (O-LPSC</w:t>
-      </w:r>
-      <w:r>
-        <w:rPr>
-          <w:vertAlign w:val="subscript"/>
-        </w:rPr>
-        <w:t xml:space="preserve">1.6</w:t>
-      </w:r>
-      <w:r>
-        <w:t xml:space="preserve">) independent runs with different random seeds were performed. The Li</w:t>
+        <w:t xml:space="preserve"> ensemble with a Langevin thermostat (time step 2 fs, friction 0.02 in ASE units) at 600, 800, and 1000 K, with 5 ps of equilibration followed by 200 ps of production. For each model and temperature, at least three independent runs with different random seeds were performed. The Li</w:t>
       </w:r>
       <w:r>
         <w:rPr>

</xml_diff>

<commit_message>
B2O3 Methods: MSD as numbered Eq. (1), D sentence refined, equations renumbered
The inline 'MSD = 6Dt + c' becomes a numbered display equation like the
other three: MSD(t) = (1/N) sum_i |r_i(t) - r_i(0)|^2 ~ 6Dt + c. The
definition follows the driver as run (li_diffusion_from_frames: production
frames only, one time origin at the start of production, Li average,
degree-1 polyfit with free intercept, 2 <= t <= 50 ps inclusive, D =
slope/6), so no time-origin average is written. 'tracer' added so the
Haven ratio in the next sentence reads correctly. Arrhenius, Nernst-Einstein
and BVSE shift to (2)-(4) with all four in-text references. Docs, docx
builder output, md and the open_items pointer updated together.

Co-Authored-By: Claude Opus 5.5 <noreply@anthropic.com>
Claude-Session: https://claude.ai/code/session_01QtbBQvJTvwH5CtkzA6CTzs
</commit_message>
<xml_diff>
--- a/kb/papers/b2o3_bo_lpsc16_methods_2026_10_20.docx
+++ b/kb/papers/b2o3_bo_lpsc16_methods_2026_10_20.docx
@@ -766,7 +766,7 @@
         <w:t xml:space="preserve">+</w:t>
       </w:r>
       <w:r>
-        <w:t xml:space="preserve"> diffusion coefficient (</w:t>
+        <w:t xml:space="preserve"> tracer diffusion coefficient (</w:t>
       </w:r>
       <w:r>
         <w:rPr>
@@ -776,17 +776,86 @@
         <w:t xml:space="preserve">D</w:t>
       </w:r>
       <w:r>
-        <w:t xml:space="preserve">) was obtained from a linear fit of the mean square displacement (MSD), MSD = 6</w:t>
-      </w:r>
-      <w:r>
-        <w:rPr>
-          <w:i/>
-          <w:iCs/>
-        </w:rPr>
-        <w:t xml:space="preserve">Dt</w:t>
-      </w:r>
-      <w:r>
-        <w:t xml:space="preserve"> + </w:t>
+        <w:t xml:space="preserve">) was obtained by fitting Eq. (1) to the mean square displacement (MSD) over 2 ≤ </w:t>
+      </w:r>
+      <w:r>
+        <w:rPr>
+          <w:i/>
+          <w:iCs/>
+        </w:rPr>
+        <w:t xml:space="preserve">t</w:t>
+      </w:r>
+      <w:r>
+        <w:t xml:space="preserve"> ≤ 50 ps, where </w:t>
+      </w:r>
+      <w:r>
+        <w:rPr>
+          <w:i/>
+          <w:iCs/>
+        </w:rPr>
+        <w:t xml:space="preserve">N</w:t>
+      </w:r>
+      <w:r>
+        <w:t xml:space="preserve"> is the number of Li</w:t>
+      </w:r>
+      <w:r>
+        <w:rPr>
+          <w:vertAlign w:val="superscript"/>
+        </w:rPr>
+        <w:t xml:space="preserve">+</w:t>
+      </w:r>
+      <w:r>
+        <w:t xml:space="preserve"> ions, </w:t>
+      </w:r>
+      <w:r>
+        <w:rPr>
+          <w:b/>
+          <w:bCs/>
+          <w:i/>
+          <w:iCs/>
+        </w:rPr>
+        <w:t xml:space="preserve">r</w:t>
+      </w:r>
+      <w:r>
+        <w:rPr>
+          <w:i/>
+          <w:iCs/>
+          <w:vertAlign w:val="subscript"/>
+        </w:rPr>
+        <w:t xml:space="preserve">i</w:t>
+      </w:r>
+      <w:r>
+        <w:t xml:space="preserve">(</w:t>
+      </w:r>
+      <w:r>
+        <w:rPr>
+          <w:i/>
+          <w:iCs/>
+        </w:rPr>
+        <w:t xml:space="preserve">t</w:t>
+      </w:r>
+      <w:r>
+        <w:t xml:space="preserve">) is the unwrapped position of ion </w:t>
+      </w:r>
+      <w:r>
+        <w:rPr>
+          <w:i/>
+          <w:iCs/>
+        </w:rPr>
+        <w:t xml:space="preserve">i</w:t>
+      </w:r>
+      <w:r>
+        <w:t xml:space="preserve"> at time </w:t>
+      </w:r>
+      <w:r>
+        <w:rPr>
+          <w:i/>
+          <w:iCs/>
+        </w:rPr>
+        <w:t xml:space="preserve">t</w:t>
+      </w:r>
+      <w:r>
+        <w:t xml:space="preserve"> after the start of production, and </w:t>
       </w:r>
       <w:r>
         <w:rPr>
@@ -796,17 +865,7 @@
         <w:t xml:space="preserve">c</w:t>
       </w:r>
       <w:r>
-        <w:t xml:space="preserve">, over 2–50 ps with a free intercept </w:t>
-      </w:r>
-      <w:r>
-        <w:rPr>
-          <w:i/>
-          <w:iCs/>
-        </w:rPr>
-        <w:t xml:space="preserve">c</w:t>
-      </w:r>
-      <w:r>
-        <w:t xml:space="preserve">. The activation energy (</w:t>
+        <w:t xml:space="preserve"> is a free intercept. The activation energy (</w:t>
       </w:r>
       <w:r>
         <w:rPr>
@@ -822,7 +881,7 @@
         <w:t xml:space="preserve">a</w:t>
       </w:r>
       <w:r>
-        <w:t xml:space="preserve">) was obtained by fitting Eq. (1) to </w:t>
+        <w:t xml:space="preserve">) was obtained by fitting Eq. (2) to </w:t>
       </w:r>
       <w:r>
         <w:rPr>
@@ -842,7 +901,7 @@
         <w:t xml:space="preserve">σ</w:t>
       </w:r>
       <w:r>
-        <w:t xml:space="preserve">) was estimated from Eq. (2) with a Haven ratio of 1 and </w:t>
+        <w:t xml:space="preserve">) was estimated from Eq. (3) with a Haven ratio of 1 and </w:t>
       </w:r>
       <w:r>
         <w:rPr>
@@ -852,7 +911,7 @@
         <w:t xml:space="preserve">D</w:t>
       </w:r>
       <w:r>
-        <w:t xml:space="preserve"> extrapolated to 273 K by Eq. (1), where </w:t>
+        <w:t xml:space="preserve"> extrapolated to 273 K by Eq. (2), where </w:t>
       </w:r>
       <w:r>
         <w:rPr>
@@ -891,6 +950,257 @@
       </w:r>
       <w:r>
         <w:t xml:space="preserve"> charge.</w:t>
+      </w:r>
+    </w:p>
+    <w:p>
+      <w:pPr>
+        <w:tabs>
+          <w:tab w:val="center" w:pos="4513"/>
+          <w:tab w:val="right" w:pos="9026"/>
+        </w:tabs>
+        <w:spacing w:after="0" w:line="480" w:lineRule="auto"/>
+      </w:pPr>
+      <w:r>
+        <w:tab/>
+      </w:r>
+      <m:oMath>
+        <m:r>
+          <m:rPr>
+            <m:sty m:val="p"/>
+          </m:rPr>
+          <w:rPr>
+            <w:rFonts w:ascii="Cambria Math" w:hAnsi="Cambria Math"/>
+          </w:rPr>
+          <m:t xml:space="preserve">MSD</m:t>
+        </m:r>
+        <m:d>
+          <m:e>
+            <m:r>
+              <w:rPr>
+                <w:rFonts w:ascii="Cambria Math" w:hAnsi="Cambria Math"/>
+              </w:rPr>
+              <m:t xml:space="preserve">t</m:t>
+            </m:r>
+          </m:e>
+        </m:d>
+        <m:r>
+          <m:rPr>
+            <m:sty m:val="p"/>
+          </m:rPr>
+          <w:rPr>
+            <w:rFonts w:ascii="Cambria Math" w:hAnsi="Cambria Math"/>
+          </w:rPr>
+          <m:t xml:space="preserve">=</m:t>
+        </m:r>
+        <m:f>
+          <m:num>
+            <m:r>
+              <m:rPr>
+                <m:sty m:val="p"/>
+              </m:rPr>
+              <w:rPr>
+                <w:rFonts w:ascii="Cambria Math" w:hAnsi="Cambria Math"/>
+              </w:rPr>
+              <m:t xml:space="preserve">1</m:t>
+            </m:r>
+          </m:num>
+          <m:den>
+            <m:r>
+              <w:rPr>
+                <w:rFonts w:ascii="Cambria Math" w:hAnsi="Cambria Math"/>
+              </w:rPr>
+              <m:t xml:space="preserve">N</m:t>
+            </m:r>
+          </m:den>
+        </m:f>
+        <m:nary>
+          <m:naryPr>
+            <m:chr m:val="∑"/>
+            <m:limLoc m:val="undOvr"/>
+          </m:naryPr>
+          <m:sub>
+            <m:r>
+              <w:rPr>
+                <w:rFonts w:ascii="Cambria Math" w:hAnsi="Cambria Math"/>
+              </w:rPr>
+              <m:t xml:space="preserve">i</m:t>
+            </m:r>
+            <m:r>
+              <m:rPr>
+                <m:sty m:val="p"/>
+              </m:rPr>
+              <w:rPr>
+                <w:rFonts w:ascii="Cambria Math" w:hAnsi="Cambria Math"/>
+              </w:rPr>
+              <m:t xml:space="preserve">=</m:t>
+            </m:r>
+            <m:r>
+              <m:rPr>
+                <m:sty m:val="p"/>
+              </m:rPr>
+              <w:rPr>
+                <w:rFonts w:ascii="Cambria Math" w:hAnsi="Cambria Math"/>
+              </w:rPr>
+              <m:t xml:space="preserve">1</m:t>
+            </m:r>
+          </m:sub>
+          <m:sup>
+            <m:r>
+              <w:rPr>
+                <w:rFonts w:ascii="Cambria Math" w:hAnsi="Cambria Math"/>
+              </w:rPr>
+              <m:t xml:space="preserve">N</m:t>
+            </m:r>
+          </m:sup>
+          <m:e>
+            <m:sSup>
+              <m:e>
+                <m:d>
+                  <m:dPr>
+                    <m:begChr m:val="|"/>
+                    <m:endChr m:val="|"/>
+                  </m:dPr>
+                  <m:e>
+                    <m:sSub>
+                      <m:e>
+                        <m:r>
+                          <m:rPr>
+                            <m:sty m:val="bi"/>
+                          </m:rPr>
+                          <w:rPr>
+                            <w:rFonts w:ascii="Cambria Math" w:hAnsi="Cambria Math"/>
+                          </w:rPr>
+                          <m:t xml:space="preserve">r</m:t>
+                        </m:r>
+                      </m:e>
+                      <m:sub>
+                        <m:r>
+                          <w:rPr>
+                            <w:rFonts w:ascii="Cambria Math" w:hAnsi="Cambria Math"/>
+                          </w:rPr>
+                          <m:t xml:space="preserve">i</m:t>
+                        </m:r>
+                      </m:sub>
+                    </m:sSub>
+                    <m:d>
+                      <m:e>
+                        <m:r>
+                          <w:rPr>
+                            <w:rFonts w:ascii="Cambria Math" w:hAnsi="Cambria Math"/>
+                          </w:rPr>
+                          <m:t xml:space="preserve">t</m:t>
+                        </m:r>
+                      </m:e>
+                    </m:d>
+                    <m:r>
+                      <m:rPr>
+                        <m:sty m:val="p"/>
+                      </m:rPr>
+                      <w:rPr>
+                        <w:rFonts w:ascii="Cambria Math" w:hAnsi="Cambria Math"/>
+                      </w:rPr>
+                      <m:t xml:space="preserve">−</m:t>
+                    </m:r>
+                    <m:sSub>
+                      <m:e>
+                        <m:r>
+                          <m:rPr>
+                            <m:sty m:val="bi"/>
+                          </m:rPr>
+                          <w:rPr>
+                            <w:rFonts w:ascii="Cambria Math" w:hAnsi="Cambria Math"/>
+                          </w:rPr>
+                          <m:t xml:space="preserve">r</m:t>
+                        </m:r>
+                      </m:e>
+                      <m:sub>
+                        <m:r>
+                          <w:rPr>
+                            <w:rFonts w:ascii="Cambria Math" w:hAnsi="Cambria Math"/>
+                          </w:rPr>
+                          <m:t xml:space="preserve">i</m:t>
+                        </m:r>
+                      </m:sub>
+                    </m:sSub>
+                    <m:d>
+                      <m:e>
+                        <m:r>
+                          <m:rPr>
+                            <m:sty m:val="p"/>
+                          </m:rPr>
+                          <w:rPr>
+                            <w:rFonts w:ascii="Cambria Math" w:hAnsi="Cambria Math"/>
+                          </w:rPr>
+                          <m:t xml:space="preserve">0</m:t>
+                        </m:r>
+                      </m:e>
+                    </m:d>
+                  </m:e>
+                </m:d>
+              </m:e>
+              <m:sup>
+                <m:r>
+                  <m:rPr>
+                    <m:sty m:val="p"/>
+                  </m:rPr>
+                  <w:rPr>
+                    <w:rFonts w:ascii="Cambria Math" w:hAnsi="Cambria Math"/>
+                  </w:rPr>
+                  <m:t xml:space="preserve">2</m:t>
+                </m:r>
+              </m:sup>
+            </m:sSup>
+          </m:e>
+        </m:nary>
+        <m:r>
+          <m:rPr>
+            <m:sty m:val="p"/>
+          </m:rPr>
+          <w:rPr>
+            <w:rFonts w:ascii="Cambria Math" w:hAnsi="Cambria Math"/>
+          </w:rPr>
+          <m:t xml:space="preserve">≈</m:t>
+        </m:r>
+        <m:r>
+          <m:rPr>
+            <m:sty m:val="p"/>
+          </m:rPr>
+          <w:rPr>
+            <w:rFonts w:ascii="Cambria Math" w:hAnsi="Cambria Math"/>
+          </w:rPr>
+          <m:t xml:space="preserve">6</m:t>
+        </m:r>
+        <m:r>
+          <w:rPr>
+            <w:rFonts w:ascii="Cambria Math" w:hAnsi="Cambria Math"/>
+          </w:rPr>
+          <m:t xml:space="preserve">D</m:t>
+        </m:r>
+        <m:r>
+          <w:rPr>
+            <w:rFonts w:ascii="Cambria Math" w:hAnsi="Cambria Math"/>
+          </w:rPr>
+          <m:t xml:space="preserve">t</m:t>
+        </m:r>
+        <m:r>
+          <m:rPr>
+            <m:sty m:val="p"/>
+          </m:rPr>
+          <w:rPr>
+            <w:rFonts w:ascii="Cambria Math" w:hAnsi="Cambria Math"/>
+          </w:rPr>
+          <m:t xml:space="preserve">+</m:t>
+        </m:r>
+        <m:r>
+          <w:rPr>
+            <w:rFonts w:ascii="Cambria Math" w:hAnsi="Cambria Math"/>
+          </w:rPr>
+          <m:t xml:space="preserve">c</m:t>
+        </m:r>
+      </m:oMath>
+      <w:r>
+        <w:tab/>
+        <w:t xml:space="preserve">(1)</w:t>
       </w:r>
     </w:p>
     <w:p>
@@ -1026,7 +1336,7 @@
       </m:oMath>
       <w:r>
         <w:tab/>
-        <w:t xml:space="preserve">(1)</w:t>
+        <w:t xml:space="preserve">(2)</w:t>
       </w:r>
     </w:p>
     <w:p>
@@ -1125,7 +1435,7 @@
       </m:oMath>
       <w:r>
         <w:tab/>
-        <w:t xml:space="preserve">(2)</w:t>
+        <w:t xml:space="preserve">(3)</w:t>
       </w:r>
     </w:p>
     <w:p>
@@ -1203,7 +1513,7 @@
         <w:t xml:space="preserve">b</w:t>
       </w:r>
       <w:r>
-        <w:t xml:space="preserve"> = 0.37 Å), and the site energy was approximated by Eq. (3), where </w:t>
+        <w:t xml:space="preserve"> = 0.37 Å), and the site energy was approximated by Eq. (4), where </w:t>
       </w:r>
       <w:r>
         <w:rPr>
@@ -1474,7 +1784,7 @@
       </m:oMath>
       <w:r>
         <w:tab/>
-        <w:t xml:space="preserve">(3)</w:t>
+        <w:t xml:space="preserve">(4)</w:t>
       </w:r>
     </w:p>
     <w:p>

</xml_diff>

<commit_message>
B2O3 Methods: Ea/sigma sentence split, run-averaged D, D0/kB/T defined
Applied the recommended wording at the user's request: Ea is fitted to the
run-averaged D (true for all three models per the reproduction in the
previous commit), the conductivity estimate is its own sentence, and the
where-clause now defines D0, kB and T next to n and q. Weighting, error-bar
definitions and the manuscript sigma/BO issues stay as first-author notes,
not Methods text. Docs, docx, md and the open_items pointer updated.

Co-Authored-By: Claude Opus 5.5 <noreply@anthropic.com>
Claude-Session: https://claude.ai/code/session_01QtbBQvJTvwH5CtkzA6CTzs
</commit_message>
<xml_diff>
--- a/kb/papers/b2o3_bo_lpsc16_methods_2026_10_20.docx
+++ b/kb/papers/b2o3_bo_lpsc16_methods_2026_10_20.docx
@@ -881,7 +881,7 @@
         <w:t xml:space="preserve">a</w:t>
       </w:r>
       <w:r>
-        <w:t xml:space="preserve">) was obtained by fitting Eq. (2) to </w:t>
+        <w:t xml:space="preserve">) was obtained by fitting Eq. (2) to the run-averaged </w:t>
       </w:r>
       <w:r>
         <w:rPr>
@@ -891,7 +891,7 @@
         <w:t xml:space="preserve">D</w:t>
       </w:r>
       <w:r>
-        <w:t xml:space="preserve"> at the three temperatures, and the ionic conductivity (</w:t>
+        <w:t xml:space="preserve"> at the three temperatures. The ionic conductivity (</w:t>
       </w:r>
       <w:r>
         <w:rPr>
@@ -901,7 +901,7 @@
         <w:t xml:space="preserve">σ</w:t>
       </w:r>
       <w:r>
-        <w:t xml:space="preserve">) was estimated from Eq. (3) with a Haven ratio of 1 and </w:t>
+        <w:t xml:space="preserve">) was estimated from Eq. (3) with a Haven ratio of 1, using </w:t>
       </w:r>
       <w:r>
         <w:rPr>
@@ -918,6 +918,48 @@
           <w:i/>
           <w:iCs/>
         </w:rPr>
+        <w:t xml:space="preserve">D</w:t>
+      </w:r>
+      <w:r>
+        <w:rPr>
+          <w:vertAlign w:val="subscript"/>
+        </w:rPr>
+        <w:t xml:space="preserve">0</w:t>
+      </w:r>
+      <w:r>
+        <w:t xml:space="preserve"> is the pre-exponential factor, </w:t>
+      </w:r>
+      <w:r>
+        <w:rPr>
+          <w:i/>
+          <w:iCs/>
+        </w:rPr>
+        <w:t xml:space="preserve">k</w:t>
+      </w:r>
+      <w:r>
+        <w:rPr>
+          <w:vertAlign w:val="subscript"/>
+        </w:rPr>
+        <w:t xml:space="preserve">B</w:t>
+      </w:r>
+      <w:r>
+        <w:t xml:space="preserve"> is the Boltzmann constant, </w:t>
+      </w:r>
+      <w:r>
+        <w:rPr>
+          <w:i/>
+          <w:iCs/>
+        </w:rPr>
+        <w:t xml:space="preserve">T</w:t>
+      </w:r>
+      <w:r>
+        <w:t xml:space="preserve"> is the temperature, </w:t>
+      </w:r>
+      <w:r>
+        <w:rPr>
+          <w:i/>
+          <w:iCs/>
+        </w:rPr>
         <w:t xml:space="preserve">n</w:t>
       </w:r>
       <w:r>
@@ -930,7 +972,7 @@
         <w:t xml:space="preserve">+</w:t>
       </w:r>
       <w:r>
-        <w:t xml:space="preserve"> number density and </w:t>
+        <w:t xml:space="preserve"> number density, and </w:t>
       </w:r>
       <w:r>
         <w:rPr>

</xml_diff>

<commit_message>
B2O3 Methods: BVSE paragraph fixed (simplified BVSE, softBV and [14] removed); softBV label corrected in CLAUDE.md and BVSE card
Methods: the map is now described as a simplified BVSE approach citing
[13] only; the softBV label and Chen & Adams 2017 are removed and the later
references renumber to 18 in total. The proposed fourth sentence was
dropped as superfluous at the user's request. R0 values are kept because
they are needed to reproduce the map; the Li-S and Li-Cl source is noted as
missing. CLAUDE.md and kb/concepts/bvse.md no longer call our fixed-b
parameters softBV, which is where the Methods label came from.

Co-Authored-By: Claude Opus 5.5 <noreply@anthropic.com>
Claude-Session: https://claude.ai/code/session_01QtbBQvJTvwH5CtkzA6CTzs
</commit_message>
<xml_diff>
--- a/kb/papers/b2o3_bo_lpsc16_methods_2026_10_20.docx
+++ b/kb/papers/b2o3_bo_lpsc16_methods_2026_10_20.docx
@@ -1495,7 +1495,7 @@
         <w:t xml:space="preserve">+</w:t>
       </w:r>
       <w:r>
-        <w:t xml:space="preserve"> migration pathways were mapped with the bond valence site energy (BVSE) approach on the </w:t>
+        <w:t xml:space="preserve"> migration pathways were mapped on the </w:t>
       </w:r>
       <w:r>
         <w:rPr>
@@ -1511,13 +1511,13 @@
         <w:t xml:space="preserve">0</w:t>
       </w:r>
       <w:r>
-        <w:t xml:space="preserve"> structures.</w:t>
+        <w:t xml:space="preserve"> structures with a simplified bond valence site energy (BVSE) approach.</w:t>
       </w:r>
       <w:r>
         <w:rPr>
           <w:vertAlign w:val="superscript"/>
         </w:rPr>
-        <w:t xml:space="preserve">[13,14]</w:t>
+        <w:t xml:space="preserve">[13]</w:t>
       </w:r>
       <w:r>
         <w:t xml:space="preserve"> On a grid with ~0.25 Å spacing, the bond valence sum of a Li</w:t>
@@ -1529,7 +1529,7 @@
         <w:t xml:space="preserve">+</w:t>
       </w:r>
       <w:r>
-        <w:t xml:space="preserve"> probe was computed over all anions within 5 Å using the softBV parameters (</w:t>
+        <w:t xml:space="preserve"> probe was computed over all anions within 5 Å (</w:t>
       </w:r>
       <w:r>
         <w:rPr>
@@ -1850,16 +1850,16 @@
         <w:rPr>
           <w:vertAlign w:val="superscript"/>
         </w:rPr>
+        <w:t xml:space="preserve">[14]</w:t>
+      </w:r>
+      <w:r>
+        <w:t xml:space="preserve"> and were broadened with a 0.05 eV Gaussian for display. Energies were referenced to the valence band maximum (VBM), which was taken from the Kohn–Sham eigenvalues of a fixed-occupation calculation. The electron localization function (ELF) was calculated from the SCF valence density,</w:t>
+      </w:r>
+      <w:r>
+        <w:rPr>
+          <w:vertAlign w:val="superscript"/>
+        </w:rPr>
         <w:t xml:space="preserve">[15]</w:t>
-      </w:r>
-      <w:r>
-        <w:t xml:space="preserve"> and were broadened with a 0.05 eV Gaussian for display. Energies were referenced to the valence band maximum (VBM), which was taken from the Kohn–Sham eigenvalues of a fixed-occupation calculation. The electron localization function (ELF) was calculated from the SCF valence density,</w:t>
-      </w:r>
-      <w:r>
-        <w:rPr>
-          <w:vertAlign w:val="superscript"/>
-        </w:rPr>
-        <w:t xml:space="preserve">[16]</w:t>
       </w:r>
       <w:r>
         <w:t xml:space="preserve"> and its value at the bond midpoint was averaged over all bonds of each type (bonds identified within 2.15, 1.9, 2.3, 2.9, and 2.95 Å for B–S, P–O, P–S, Li–S, and Li–Cl, respectively).</w:t>
@@ -1877,7 +1877,7 @@
         <w:rPr>
           <w:vertAlign w:val="superscript"/>
         </w:rPr>
-        <w:t xml:space="preserve">[17]</w:t>
+        <w:t xml:space="preserve">[16]</w:t>
       </w:r>
       <w:r>
         <w:t xml:space="preserve"> was performed with LOBSTER 5.1.1.</w:t>
@@ -1886,7 +1886,7 @@
         <w:rPr>
           <w:vertAlign w:val="superscript"/>
         </w:rPr>
-        <w:t xml:space="preserve">[18,19]</w:t>
+        <w:t xml:space="preserve">[17,18]</w:t>
       </w:r>
       <w:r>
         <w:t xml:space="preserve"> Because LOBSTER requires PAW wavefunctions, the SCF and non-self-consistent (no symmetry, 960 bands) calculations were repeated on the same structure with PAW datasets from PSlibrary,</w:t>
@@ -2498,27 +2498,27 @@
         <w:tab/>
       </w:r>
       <w:r>
-        <w:t xml:space="preserve">H. Chen, S. Adams, </w:t>
-      </w:r>
-      <w:r>
-        <w:rPr>
-          <w:i/>
-          <w:iCs/>
-        </w:rPr>
-        <w:t xml:space="preserve">IUCrJ</w:t>
-      </w:r>
-      <w:r>
-        <w:t xml:space="preserve"> 2017, </w:t>
-      </w:r>
-      <w:r>
-        <w:rPr>
-          <w:i/>
-          <w:iCs/>
-        </w:rPr>
-        <w:t xml:space="preserve">4</w:t>
-      </w:r>
-      <w:r>
-        <w:t xml:space="preserve">, 614–625.</w:t>
+        <w:t xml:space="preserve">M. Kawamura, Y. Gohda, S. Tsuneyuki, </w:t>
+      </w:r>
+      <w:r>
+        <w:rPr>
+          <w:i/>
+          <w:iCs/>
+        </w:rPr>
+        <w:t xml:space="preserve">Phys. Rev. B</w:t>
+      </w:r>
+      <w:r>
+        <w:t xml:space="preserve"> 2014, </w:t>
+      </w:r>
+      <w:r>
+        <w:rPr>
+          <w:i/>
+          <w:iCs/>
+        </w:rPr>
+        <w:t xml:space="preserve">89</w:t>
+      </w:r>
+      <w:r>
+        <w:t xml:space="preserve">, 094515.</w:t>
       </w:r>
     </w:p>
     <w:p>
@@ -2536,27 +2536,27 @@
         <w:tab/>
       </w:r>
       <w:r>
-        <w:t xml:space="preserve">M. Kawamura, Y. Gohda, S. Tsuneyuki, </w:t>
-      </w:r>
-      <w:r>
-        <w:rPr>
-          <w:i/>
-          <w:iCs/>
-        </w:rPr>
-        <w:t xml:space="preserve">Phys. Rev. B</w:t>
-      </w:r>
-      <w:r>
-        <w:t xml:space="preserve"> 2014, </w:t>
-      </w:r>
-      <w:r>
-        <w:rPr>
-          <w:i/>
-          <w:iCs/>
-        </w:rPr>
-        <w:t xml:space="preserve">89</w:t>
-      </w:r>
-      <w:r>
-        <w:t xml:space="preserve">, 094515.</w:t>
+        <w:t xml:space="preserve">A. D. Becke, K. E. Edgecombe, </w:t>
+      </w:r>
+      <w:r>
+        <w:rPr>
+          <w:i/>
+          <w:iCs/>
+        </w:rPr>
+        <w:t xml:space="preserve">J. Chem. Phys.</w:t>
+      </w:r>
+      <w:r>
+        <w:t xml:space="preserve"> 1990, </w:t>
+      </w:r>
+      <w:r>
+        <w:rPr>
+          <w:i/>
+          <w:iCs/>
+        </w:rPr>
+        <w:t xml:space="preserve">92</w:t>
+      </w:r>
+      <w:r>
+        <w:t xml:space="preserve">, 5397–5403.</w:t>
       </w:r>
     </w:p>
     <w:p>
@@ -2574,27 +2574,27 @@
         <w:tab/>
       </w:r>
       <w:r>
-        <w:t xml:space="preserve">A. D. Becke, K. E. Edgecombe, </w:t>
-      </w:r>
-      <w:r>
-        <w:rPr>
-          <w:i/>
-          <w:iCs/>
-        </w:rPr>
-        <w:t xml:space="preserve">J. Chem. Phys.</w:t>
-      </w:r>
-      <w:r>
-        <w:t xml:space="preserve"> 1990, </w:t>
-      </w:r>
-      <w:r>
-        <w:rPr>
-          <w:i/>
-          <w:iCs/>
-        </w:rPr>
-        <w:t xml:space="preserve">92</w:t>
-      </w:r>
-      <w:r>
-        <w:t xml:space="preserve">, 5397–5403.</w:t>
+        <w:t xml:space="preserve">R. Dronskowski, P. E. Blöchl, </w:t>
+      </w:r>
+      <w:r>
+        <w:rPr>
+          <w:i/>
+          <w:iCs/>
+        </w:rPr>
+        <w:t xml:space="preserve">J. Phys. Chem.</w:t>
+      </w:r>
+      <w:r>
+        <w:t xml:space="preserve"> 1993, </w:t>
+      </w:r>
+      <w:r>
+        <w:rPr>
+          <w:i/>
+          <w:iCs/>
+        </w:rPr>
+        <w:t xml:space="preserve">97</w:t>
+      </w:r>
+      <w:r>
+        <w:t xml:space="preserve">, 8617–8624.</w:t>
       </w:r>
     </w:p>
     <w:p>
@@ -2612,27 +2612,27 @@
         <w:tab/>
       </w:r>
       <w:r>
-        <w:t xml:space="preserve">R. Dronskowski, P. E. Blöchl, </w:t>
-      </w:r>
-      <w:r>
-        <w:rPr>
-          <w:i/>
-          <w:iCs/>
-        </w:rPr>
-        <w:t xml:space="preserve">J. Phys. Chem.</w:t>
-      </w:r>
-      <w:r>
-        <w:t xml:space="preserve"> 1993, </w:t>
-      </w:r>
-      <w:r>
-        <w:rPr>
-          <w:i/>
-          <w:iCs/>
-        </w:rPr>
-        <w:t xml:space="preserve">97</w:t>
-      </w:r>
-      <w:r>
-        <w:t xml:space="preserve">, 8617–8624.</w:t>
+        <w:t xml:space="preserve">S. Maintz, V. L. Deringer, A. L. Tchougréeff, R. Dronskowski, </w:t>
+      </w:r>
+      <w:r>
+        <w:rPr>
+          <w:i/>
+          <w:iCs/>
+        </w:rPr>
+        <w:t xml:space="preserve">J. Comput. Chem.</w:t>
+      </w:r>
+      <w:r>
+        <w:t xml:space="preserve"> 2016, </w:t>
+      </w:r>
+      <w:r>
+        <w:rPr>
+          <w:i/>
+          <w:iCs/>
+        </w:rPr>
+        <w:t xml:space="preserve">37</w:t>
+      </w:r>
+      <w:r>
+        <w:t xml:space="preserve">, 1030–1035.</w:t>
       </w:r>
     </w:p>
     <w:p>
@@ -2645,44 +2645,6 @@
       </w:pPr>
       <w:r>
         <w:t xml:space="preserve">18.</w:t>
-      </w:r>
-      <w:r>
-        <w:tab/>
-      </w:r>
-      <w:r>
-        <w:t xml:space="preserve">S. Maintz, V. L. Deringer, A. L. Tchougréeff, R. Dronskowski, </w:t>
-      </w:r>
-      <w:r>
-        <w:rPr>
-          <w:i/>
-          <w:iCs/>
-        </w:rPr>
-        <w:t xml:space="preserve">J. Comput. Chem.</w:t>
-      </w:r>
-      <w:r>
-        <w:t xml:space="preserve"> 2016, </w:t>
-      </w:r>
-      <w:r>
-        <w:rPr>
-          <w:i/>
-          <w:iCs/>
-        </w:rPr>
-        <w:t xml:space="preserve">37</w:t>
-      </w:r>
-      <w:r>
-        <w:t xml:space="preserve">, 1030–1035.</w:t>
-      </w:r>
-    </w:p>
-    <w:p>
-      <w:pPr>
-        <w:tabs>
-          <w:tab w:val="left" w:pos="480"/>
-        </w:tabs>
-        <w:spacing w:after="0" w:line="480" w:lineRule="auto"/>
-        <w:ind w:left="480" w:hanging="480"/>
-      </w:pPr>
-      <w:r>
-        <w:t xml:space="preserve">19.</w:t>
       </w:r>
       <w:r>
         <w:tab/>

</xml_diff>